<commit_message>
test(docx): expand public edge-case fixture
Add synthetic document-level vertical and RTL coverage to the public DOCX corpus. The vertical sections cover section-scoped tbRl flow, long marks, brackets, punctuation, document grids, ruby, ruby-base tabs, and tate-chu-yoko before returning to horizontal flow. The RTL sections cover Arabic and Hebrew mixing, logical tabs, fitText, and Kashida justification. Additional compact cases exercise contextual spacing, automatic line spacing, Thai distribution, and segmented merged-cell borders.

The cases follow ECMA-376 section and paragraph/run properties rather than sample-specific rendering heuristics. Verified as a valid OOXML ZIP, rendered through LibreOffice across 15 pages, and parsed successfully by the project WASM parser.

Co-Authored-By: Codex GPT-5.6 <noreply@openai.com>
</commit_message>
<xml_diff>
--- a/packages/docx/public/demo/test-1.docx
+++ b/packages/docx/public/demo/test-1.docx
@@ -4039,19 +4039,1664 @@
         <w:t>The corpus ends with an intentionally empty paragraph after this sentence.</w:t>
       </w:r>
     </w:p>
-    <w:p/>
+    <w:p>
+      <w:pPr>
+        <w:sectPr>
+          <w:type w:val="nextPage"/>
+          <w:headerReference w:type="default" r:id="rId27"/>
+          <w:headerReference w:type="first" r:id="rId28"/>
+          <w:headerReference w:type="even" r:id="rId29"/>
+          <w:footerReference w:type="default" r:id="rId30"/>
+          <w:pgSz w:w="12240" w:h="15840"/>
+          <w:pgMar w:top="1152" w:right="1440" w:bottom="1152" w:left="1440" w:header="648" w:footer="648" w:gutter="0"/>
+          <w:cols w:space="360" w:num="1" w:sep="1"/>
+          <w:titlePg/>
+          <w:docGrid w:linePitch="360" w:type="linesAndChars" w:charSpace="0"/>
+          <w:lnNumType w:countBy="1" w:start="1" w:distance="360" w:restart="newPage"/>
+          <w:pgNumType w:start="1" w:fmt="lowerRoman"/>
+          <w:pgBorders w:offsetFrom="page" w:display="allPages" w:zOrder="back">
+            <w:top w:val="single" w:sz="6" w:space="20" w:color="CAD3DA"/>
+            <w:left w:val="single" w:sz="6" w:space="20" w:color="CAD3DA"/>
+            <w:bottom w:val="single" w:sz="6" w:space="20" w:color="CAD3DA"/>
+            <w:right w:val="single" w:sz="6" w:space="20" w:color="CAD3DA"/>
+          </w:pgBorders>
+        </w:sectPr>
+      </w:pPr>
+    </w:p>
+    <w:p>
+      <w:pPr>
+        <w:keepNext/>
+        <w:spacing w:before="160" w:after="100" w:line="276" w:lineRule="auto"/>
+      </w:pPr>
+      <w:r>
+        <w:rPr>
+          <w:rFonts w:ascii="Arial" w:hAnsi="Arial" w:eastAsia="Yu Mincho" w:cs="Arial"/>
+          <w:b/>
+          <w:color w:val="FFFFFF"/>
+          <w:sz w:val="17"/>
+          <w:szCs w:val="17"/>
+          <w:shd w:fill="2A7F8E" w:val="clear"/>
+        </w:rPr>
+        <w:t>D-VERT-001</w:t>
+      </w:r>
+      <w:r>
+        <w:rPr>
+          <w:rFonts w:ascii="Arial" w:hAnsi="Arial" w:eastAsia="Yu Mincho" w:cs="Arial"/>
+          <w:sz w:val="17"/>
+          <w:szCs w:val="17"/>
+        </w:rPr>
+        <w:t xml:space="preserve">   </w:t>
+      </w:r>
+      <w:r>
+        <w:rPr>
+          <w:rFonts w:ascii="Arial" w:hAnsi="Arial" w:eastAsia="Yu Mincho" w:cs="Arial"/>
+          <w:b/>
+          <w:color w:val="17324D"/>
+          <w:sz w:val="21"/>
+          <w:szCs w:val="21"/>
+        </w:rPr>
+        <w:t>True vertical section and horizontal-section handoff</w:t>
+      </w:r>
+    </w:p>
+    <w:p>
+      <w:pPr>
+        <w:spacing w:before="0" w:after="100" w:line="276" w:lineRule="auto"/>
+      </w:pPr>
+      <w:r>
+        <w:rPr>
+          <w:rFonts w:ascii="Arial" w:hAnsi="Arial" w:eastAsia="Yu Mincho" w:cs="Arial"/>
+          <w:color w:val="5B6573"/>
+          <w:sz w:val="17"/>
+          <w:szCs w:val="17"/>
+          <w:lang w:val="en-US" w:eastAsia="en-US"/>
+        </w:rPr>
+        <w:t>A non-final tbRl section exercises section-scoped flow, grid, and the return to horizontal text.</w:t>
+      </w:r>
+    </w:p>
+    <w:p>
+      <w:pPr>
+        <w:kinsoku/>
+        <w:spacing w:before="0" w:after="180" w:line="360" w:lineRule="auto"/>
+      </w:pPr>
+      <w:r>
+        <w:rPr>
+          <w:rFonts w:ascii="Yu Mincho" w:hAnsi="Yu Mincho" w:eastAsia="Yu Mincho" w:cs="Yu Mincho"/>
+          <w:sz w:val="30"/>
+          <w:szCs w:val="30"/>
+          <w:lang w:val="ja-JP" w:eastAsia="ja-JP"/>
+        </w:rPr>
+        <w:t>縦書き本文。右上から下へ進み、列は右から左へ送られます。</w:t>
+      </w:r>
+    </w:p>
+    <w:p>
+      <w:pPr>
+        <w:keepNext/>
+        <w:spacing w:before="160" w:after="100" w:line="276" w:lineRule="auto"/>
+      </w:pPr>
+      <w:r>
+        <w:rPr>
+          <w:rFonts w:ascii="Arial" w:hAnsi="Arial" w:eastAsia="Yu Mincho" w:cs="Arial"/>
+          <w:b/>
+          <w:color w:val="FFFFFF"/>
+          <w:sz w:val="17"/>
+          <w:szCs w:val="17"/>
+          <w:shd w:fill="2A7F8E" w:val="clear"/>
+        </w:rPr>
+        <w:t>D-VERT-002</w:t>
+      </w:r>
+      <w:r>
+        <w:rPr>
+          <w:rFonts w:ascii="Arial" w:hAnsi="Arial" w:eastAsia="Yu Mincho" w:cs="Arial"/>
+          <w:sz w:val="17"/>
+          <w:szCs w:val="17"/>
+        </w:rPr>
+        <w:t xml:space="preserve">   </w:t>
+      </w:r>
+      <w:r>
+        <w:rPr>
+          <w:rFonts w:ascii="Arial" w:hAnsi="Arial" w:eastAsia="Yu Mincho" w:cs="Arial"/>
+          <w:b/>
+          <w:color w:val="17324D"/>
+          <w:sz w:val="21"/>
+          <w:szCs w:val="21"/>
+        </w:rPr>
+        <w:t>Vertical forms: prolonged sound marks, brackets, and punctuation</w:t>
+      </w:r>
+    </w:p>
+    <w:p>
+      <w:pPr>
+        <w:kinsoku/>
+        <w:spacing w:before="0" w:after="180" w:line="360" w:lineRule="auto"/>
+      </w:pPr>
+      <w:r>
+        <w:rPr>
+          <w:rFonts w:ascii="Yu Mincho" w:hAnsi="Yu Mincho" w:eastAsia="Yu Mincho" w:cs="Yu Mincho"/>
+          <w:sz w:val="30"/>
+          <w:szCs w:val="30"/>
+          <w:lang w:val="ja-JP" w:eastAsia="ja-JP"/>
+        </w:rPr>
+        <w:t>コーヒー・テーマーABC12・スーパーーX。波形〜～、句読点、。「かぎ」『二重』（丸）【隅付き】〔亀甲〕〈山〉《二重山》〖白隅〗：；！？</w:t>
+      </w:r>
+    </w:p>
+    <w:p>
+      <w:pPr>
+        <w:kinsoku/>
+        <w:spacing w:before="0" w:after="180" w:line="360" w:lineRule="auto"/>
+      </w:pPr>
+      <w:r>
+        <w:rPr>
+          <w:rFonts w:ascii="Yu Mincho" w:hAnsi="Yu Mincho" w:eastAsia="Yu Mincho" w:cs="Yu Mincho"/>
+          <w:sz w:val="30"/>
+          <w:szCs w:val="30"/>
+          <w:em w:val="dot"/>
+          <w:lang w:val="ja-JP" w:eastAsia="ja-JP"/>
+        </w:rPr>
+        <w:t>傍点</w:t>
+      </w:r>
+      <w:r>
+        <w:rPr>
+          <w:rFonts w:ascii="Yu Mincho" w:hAnsi="Yu Mincho" w:eastAsia="Yu Mincho" w:cs="Yu Mincho"/>
+          <w:sz w:val="30"/>
+          <w:szCs w:val="30"/>
+          <w:lang w:val="ja-JP" w:eastAsia="ja-JP"/>
+        </w:rPr>
+        <w:t xml:space="preserve"> と通常文字、</w:t>
+      </w:r>
+      <w:r>
+        <w:rPr>
+          <w:rFonts w:ascii="Yu Mincho" w:hAnsi="Yu Mincho" w:eastAsia="Yu Mincho" w:cs="Yu Mincho"/>
+          <w:sz w:val="30"/>
+          <w:szCs w:val="30"/>
+          <w:lang w:val="ja-JP" w:eastAsia="ja-JP"/>
+          <w:eastAsianLayout w:combine="1"/>
+        </w:rPr>
+        <w:t>12</w:t>
+      </w:r>
+      <w:r>
+        <w:rPr>
+          <w:rFonts w:ascii="Yu Mincho" w:hAnsi="Yu Mincho" w:eastAsia="Yu Mincho" w:cs="Yu Mincho"/>
+          <w:sz w:val="30"/>
+          <w:szCs w:val="30"/>
+          <w:lang w:val="ja-JP" w:eastAsia="ja-JP"/>
+        </w:rPr>
+        <w:t>月、</w:t>
+      </w:r>
+      <w:r>
+        <w:rPr>
+          <w:rFonts w:ascii="Yu Mincho" w:hAnsi="Yu Mincho" w:eastAsia="Yu Mincho" w:cs="Yu Mincho"/>
+          <w:sz w:val="30"/>
+          <w:szCs w:val="30"/>
+          <w:lang w:val="ja-JP" w:eastAsia="ja-JP"/>
+          <w:eastAsianLayout w:combine="1" w:combineBrackets="round"/>
+        </w:rPr>
+        <w:t>(34)</w:t>
+      </w:r>
+      <w:r>
+        <w:rPr>
+          <w:rFonts w:ascii="Yu Mincho" w:hAnsi="Yu Mincho" w:eastAsia="Yu Mincho" w:cs="Yu Mincho"/>
+          <w:sz w:val="30"/>
+          <w:szCs w:val="30"/>
+          <w:lang w:val="ja-JP" w:eastAsia="ja-JP"/>
+        </w:rPr>
+        <w:t>組を同じ段落で比較します。</w:t>
+      </w:r>
+    </w:p>
+    <w:p>
+      <w:pPr>
+        <w:keepNext/>
+        <w:spacing w:before="160" w:after="100" w:line="276" w:lineRule="auto"/>
+      </w:pPr>
+      <w:r>
+        <w:rPr>
+          <w:rFonts w:ascii="Arial" w:hAnsi="Arial" w:eastAsia="Yu Mincho" w:cs="Arial"/>
+          <w:b/>
+          <w:color w:val="FFFFFF"/>
+          <w:sz w:val="17"/>
+          <w:szCs w:val="17"/>
+          <w:shd w:fill="2A7F8E" w:val="clear"/>
+        </w:rPr>
+        <w:t>D-VERT-003</w:t>
+      </w:r>
+      <w:r>
+        <w:rPr>
+          <w:rFonts w:ascii="Arial" w:hAnsi="Arial" w:eastAsia="Yu Mincho" w:cs="Arial"/>
+          <w:sz w:val="17"/>
+          <w:szCs w:val="17"/>
+        </w:rPr>
+        <w:t xml:space="preserve">   </w:t>
+      </w:r>
+      <w:r>
+        <w:rPr>
+          <w:rFonts w:ascii="Arial" w:hAnsi="Arial" w:eastAsia="Yu Mincho" w:cs="Arial"/>
+          <w:b/>
+          <w:color w:val="17324D"/>
+          <w:sz w:val="21"/>
+          <w:szCs w:val="21"/>
+        </w:rPr>
+        <w:t>18 pt document grid with 14 pt and 16 pt body text</w:t>
+      </w:r>
+    </w:p>
+    <w:p>
+      <w:pPr>
+        <w:kinsoku/>
+        <w:spacing w:before="0" w:after="160" w:line="360" w:lineRule="auto"/>
+      </w:pPr>
+      <w:r>
+        <w:rPr>
+          <w:rFonts w:ascii="Yu Mincho" w:hAnsi="Yu Mincho" w:eastAsia="Yu Mincho" w:cs="Yu Mincho"/>
+          <w:sz w:val="28"/>
+          <w:szCs w:val="28"/>
+          <w:lang w:val="ja-JP" w:eastAsia="ja-JP"/>
+        </w:rPr>
+        <w:t>十四ポイント：文字送りと列送りの基準を確認します。ー「」：；</w:t>
+      </w:r>
+    </w:p>
+    <w:p>
+      <w:pPr>
+        <w:kinsoku/>
+        <w:spacing w:before="0" w:after="160" w:line="360" w:lineRule="auto"/>
+      </w:pPr>
+      <w:r>
+        <w:rPr>
+          <w:rFonts w:ascii="Yu Mincho" w:hAnsi="Yu Mincho" w:eastAsia="Yu Mincho" w:cs="Yu Mincho"/>
+          <w:sz w:val="32"/>
+          <w:szCs w:val="32"/>
+          <w:lang w:val="ja-JP" w:eastAsia="ja-JP"/>
+        </w:rPr>
+        <w:t>十六ポイント：同じ十八ポイントのグリッドへ配置します。ー（）〖〗</w:t>
+      </w:r>
+    </w:p>
+    <w:p>
+      <w:pPr>
+        <w:spacing w:before="0" w:after="0" w:line="276" w:lineRule="auto"/>
+      </w:pPr>
+      <w:r>
+        <w:rPr>
+          <w:rFonts w:ascii="Arial" w:hAnsi="Arial" w:eastAsia="Yu Mincho" w:cs="Arial"/>
+          <w:sz w:val="22"/>
+          <w:szCs w:val="22"/>
+        </w:rPr>
+        <w:br w:type="page"/>
+      </w:r>
+    </w:p>
+    <w:p>
+      <w:pPr>
+        <w:keepNext/>
+        <w:spacing w:before="160" w:after="100" w:line="276" w:lineRule="auto"/>
+      </w:pPr>
+      <w:r>
+        <w:rPr>
+          <w:rFonts w:ascii="Arial" w:hAnsi="Arial" w:eastAsia="Yu Mincho" w:cs="Arial"/>
+          <w:b/>
+          <w:color w:val="FFFFFF"/>
+          <w:sz w:val="17"/>
+          <w:szCs w:val="17"/>
+          <w:shd w:fill="2A7F8E" w:val="clear"/>
+        </w:rPr>
+        <w:t>D-VERT-004</w:t>
+      </w:r>
+      <w:r>
+        <w:rPr>
+          <w:rFonts w:ascii="Arial" w:hAnsi="Arial" w:eastAsia="Yu Mincho" w:cs="Arial"/>
+          <w:sz w:val="17"/>
+          <w:szCs w:val="17"/>
+        </w:rPr>
+        <w:t xml:space="preserve">   </w:t>
+      </w:r>
+      <w:r>
+        <w:rPr>
+          <w:rFonts w:ascii="Arial" w:hAnsi="Arial" w:eastAsia="Yu Mincho" w:cs="Arial"/>
+          <w:b/>
+          <w:color w:val="17324D"/>
+          <w:sz w:val="21"/>
+          <w:szCs w:val="21"/>
+        </w:rPr>
+        <w:t>Vertical ruby, ruby-base tab, and tate-chu-yoko</w:t>
+      </w:r>
+    </w:p>
+    <w:p>
+      <w:pPr>
+        <w:kinsoku/>
+        <w:spacing w:before="0" w:after="220" w:line="400" w:lineRule="auto"/>
+      </w:pPr>
+      <w:r>
+        <w:rPr>
+          <w:rFonts w:ascii="Yu Mincho" w:hAnsi="Yu Mincho" w:eastAsia="Yu Mincho" w:cs="Yu Mincho"/>
+          <w:sz w:val="28"/>
+          <w:szCs w:val="28"/>
+          <w:lang w:val="ja-JP" w:eastAsia="ja-JP"/>
+        </w:rPr>
+        <w:t>通常ルビ：</w:t>
+      </w:r>
+      <w:ruby>
+        <w:rubyPr>
+          <w:rubyAlign w:val="rightVertical"/>
+          <w:hps w:val="14"/>
+          <w:hpsRaise w:val="18"/>
+          <w:hpsBaseText w:val="28"/>
+          <w:lid w:val="ja-JP"/>
+        </w:rubyPr>
+        <w:rt>
+          <w:r>
+            <w:rPr>
+              <w:rFonts w:ascii="Yu Mincho" w:hAnsi="Yu Mincho" w:eastAsia="Yu Mincho" w:cs="Yu Mincho"/>
+              <w:sz w:val="14"/>
+              <w:szCs w:val="14"/>
+              <w:lang w:val="ja-JP" w:eastAsia="ja-JP"/>
+            </w:rPr>
+            <w:t>たてがき</w:t>
+          </w:r>
+        </w:rt>
+        <w:rubyBase>
+          <w:r>
+            <w:rPr>
+              <w:rFonts w:ascii="Yu Mincho" w:hAnsi="Yu Mincho" w:eastAsia="Yu Mincho" w:cs="Yu Mincho"/>
+              <w:sz w:val="28"/>
+              <w:szCs w:val="28"/>
+              <w:lang w:val="ja-JP" w:eastAsia="ja-JP"/>
+            </w:rPr>
+            <w:t>縦書</w:t>
+          </w:r>
+        </w:rubyBase>
+      </w:ruby>
+      <w:r>
+        <w:rPr>
+          <w:rFonts w:ascii="Yu Mincho" w:hAnsi="Yu Mincho" w:eastAsia="Yu Mincho" w:cs="Yu Mincho"/>
+          <w:sz w:val="28"/>
+          <w:szCs w:val="28"/>
+          <w:lang w:val="ja-JP" w:eastAsia="ja-JP"/>
+        </w:rPr>
+        <w:t>。タブ入りルビ：</w:t>
+      </w:r>
+      <w:ruby>
+        <w:rubyPr>
+          <w:rubyAlign w:val="rightVertical"/>
+          <w:hps w:val="14"/>
+          <w:hpsRaise w:val="18"/>
+          <w:hpsBaseText w:val="28"/>
+          <w:lid w:val="ja-JP"/>
+        </w:rubyPr>
+        <w:rt>
+          <w:r>
+            <w:rPr>
+              <w:rFonts w:ascii="Yu Mincho" w:hAnsi="Yu Mincho" w:eastAsia="Yu Mincho" w:cs="Yu Mincho"/>
+              <w:sz w:val="14"/>
+              <w:szCs w:val="14"/>
+              <w:lang w:val="ja-JP" w:eastAsia="ja-JP"/>
+            </w:rPr>
+            <w:t>きてい</w:t>
+          </w:r>
+        </w:rt>
+        <w:rubyBase>
+          <w:r>
+            <w:rPr>
+              <w:rFonts w:ascii="Yu Mincho" w:hAnsi="Yu Mincho" w:eastAsia="Yu Mincho" w:cs="Yu Mincho"/>
+              <w:sz w:val="28"/>
+              <w:szCs w:val="28"/>
+              <w:lang w:val="ja-JP" w:eastAsia="ja-JP"/>
+            </w:rPr>
+            <w:t>基</w:t>
+          </w:r>
+          <w:r>
+            <w:rPr>
+              <w:rFonts w:ascii="Yu Mincho" w:hAnsi="Yu Mincho" w:eastAsia="Yu Mincho" w:cs="Yu Mincho"/>
+              <w:sz w:val="28"/>
+              <w:szCs w:val="28"/>
+              <w:lang w:val="ja-JP" w:eastAsia="ja-JP"/>
+            </w:rPr>
+            <w:tab/>
+          </w:r>
+          <w:r>
+            <w:rPr>
+              <w:rFonts w:ascii="Yu Mincho" w:hAnsi="Yu Mincho" w:eastAsia="Yu Mincho" w:cs="Yu Mincho"/>
+              <w:sz w:val="28"/>
+              <w:szCs w:val="28"/>
+              <w:lang w:val="ja-JP" w:eastAsia="ja-JP"/>
+            </w:rPr>
+            <w:t>底</w:t>
+          </w:r>
+        </w:rubyBase>
+      </w:ruby>
+      <w:r>
+        <w:rPr>
+          <w:rFonts w:ascii="Yu Mincho" w:hAnsi="Yu Mincho" w:eastAsia="Yu Mincho" w:cs="Yu Mincho"/>
+          <w:sz w:val="28"/>
+          <w:szCs w:val="28"/>
+          <w:lang w:val="ja-JP" w:eastAsia="ja-JP"/>
+        </w:rPr>
+        <w:t>。混在：令和</w:t>
+      </w:r>
+      <w:r>
+        <w:rPr>
+          <w:rFonts w:ascii="Yu Mincho" w:hAnsi="Yu Mincho" w:eastAsia="Yu Mincho" w:cs="Yu Mincho"/>
+          <w:sz w:val="28"/>
+          <w:szCs w:val="28"/>
+          <w:lang w:val="ja-JP" w:eastAsia="ja-JP"/>
+          <w:eastAsianLayout w:combine="1"/>
+        </w:rPr>
+        <w:t>12</w:t>
+      </w:r>
+      <w:r>
+        <w:rPr>
+          <w:rFonts w:ascii="Yu Mincho" w:hAnsi="Yu Mincho" w:eastAsia="Yu Mincho" w:cs="Yu Mincho"/>
+          <w:sz w:val="28"/>
+          <w:szCs w:val="28"/>
+          <w:lang w:val="ja-JP" w:eastAsia="ja-JP"/>
+        </w:rPr>
+        <w:t>年、</w:t>
+      </w:r>
+      <w:r>
+        <w:rPr>
+          <w:rFonts w:ascii="Yu Mincho" w:hAnsi="Yu Mincho" w:eastAsia="Yu Mincho" w:cs="Yu Mincho"/>
+          <w:sz w:val="28"/>
+          <w:szCs w:val="28"/>
+          <w:lang w:val="ja-JP" w:eastAsia="ja-JP"/>
+          <w:eastAsianLayout w:combine="1"/>
+        </w:rPr>
+        <w:t>AB</w:t>
+      </w:r>
+      <w:r>
+        <w:rPr>
+          <w:rFonts w:ascii="Yu Mincho" w:hAnsi="Yu Mincho" w:eastAsia="Yu Mincho" w:cs="Yu Mincho"/>
+          <w:sz w:val="28"/>
+          <w:szCs w:val="28"/>
+          <w:lang w:val="ja-JP" w:eastAsia="ja-JP"/>
+        </w:rPr>
+        <w:t>版。</w:t>
+      </w:r>
+    </w:p>
+    <w:p>
+      <w:pPr>
+        <w:kinsoku/>
+        <w:spacing w:before="0" w:after="180" w:line="360" w:lineRule="auto"/>
+      </w:pPr>
+      <w:r>
+        <w:rPr>
+          <w:rFonts w:ascii="Yu Mincho" w:hAnsi="Yu Mincho" w:eastAsia="Yu Mincho" w:cs="Yu Mincho"/>
+          <w:sz w:val="28"/>
+          <w:szCs w:val="28"/>
+          <w:lang w:val="ja-JP" w:eastAsia="ja-JP"/>
+        </w:rPr>
+        <w:t>行末に開き括弧が残らないこと、行頭に閉じ括弧や句読点が送られないことを確認する長めの文章です。「約物の禁則処理」、長音符ー、波形〜、英字ABCを連続させます。</w:t>
+      </w:r>
+    </w:p>
+    <w:p>
+      <w:pPr>
+        <w:sectPr>
+          <w:type w:val="nextPage"/>
+          <w:pgSz w:w="12240" w:h="15840"/>
+          <w:pgMar w:top="1152" w:right="1440" w:bottom="1152" w:left="1440" w:header="648" w:footer="648" w:gutter="0"/>
+          <w:cols w:space="360" w:num="1"/>
+          <w:textDirection w:val="tbRl"/>
+          <w:docGrid w:type="linesAndChars" w:linePitch="360" w:charSpace="0"/>
+          <w:pgBorders w:offsetFrom="page" w:display="allPages" w:zOrder="back">
+            <w:top w:val="single" w:sz="6" w:space="20" w:color="CAD3DA"/>
+            <w:left w:val="single" w:sz="6" w:space="20" w:color="CAD3DA"/>
+            <w:bottom w:val="single" w:sz="6" w:space="20" w:color="CAD3DA"/>
+            <w:right w:val="single" w:sz="6" w:space="20" w:color="CAD3DA"/>
+          </w:pgBorders>
+        </w:sectPr>
+      </w:pPr>
+    </w:p>
+    <w:p>
+      <w:pPr>
+        <w:keepNext/>
+        <w:bidi/>
+        <w:spacing w:before="160" w:after="100" w:line="276" w:lineRule="auto"/>
+        <w:jc w:val="right"/>
+      </w:pPr>
+      <w:r>
+        <w:rPr>
+          <w:rFonts w:ascii="Arial" w:hAnsi="Arial" w:eastAsia="Yu Mincho" w:cs="Arial"/>
+          <w:b/>
+          <w:bCs/>
+          <w:color w:val="FFFFFF"/>
+          <w:sz w:val="17"/>
+          <w:szCs w:val="17"/>
+          <w:rtl/>
+          <w:cs/>
+          <w:lang w:val="ar-SA" w:bidi="ar-SA"/>
+          <w:shd w:fill="2A7F8E" w:val="clear"/>
+        </w:rPr>
+        <w:t>D-RTL-002</w:t>
+      </w:r>
+      <w:r>
+        <w:rPr>
+          <w:rFonts w:ascii="Arial" w:hAnsi="Arial" w:eastAsia="Yu Mincho" w:cs="Arial"/>
+          <w:sz w:val="17"/>
+          <w:szCs w:val="17"/>
+          <w:rtl/>
+          <w:cs/>
+          <w:lang w:val="ar-SA" w:bidi="ar-SA"/>
+        </w:rPr>
+        <w:t xml:space="preserve">   </w:t>
+      </w:r>
+      <w:r>
+        <w:rPr>
+          <w:rFonts w:ascii="Arial" w:hAnsi="Arial" w:eastAsia="Yu Mincho" w:cs="Arial"/>
+          <w:b/>
+          <w:bCs/>
+          <w:color w:val="17324D"/>
+          <w:sz w:val="21"/>
+          <w:szCs w:val="21"/>
+          <w:rtl/>
+          <w:cs/>
+          <w:lang w:val="ar-SA" w:bidi="ar-SA"/>
+        </w:rPr>
+        <w:t>Full RTL paragraphs with mixed scripts and mirrored punctuation</w:t>
+      </w:r>
+    </w:p>
+    <w:p>
+      <w:pPr>
+        <w:bidi/>
+        <w:spacing w:before="0" w:after="100" w:line="276" w:lineRule="auto"/>
+        <w:jc w:val="right"/>
+      </w:pPr>
+      <w:r>
+        <w:rPr>
+          <w:rFonts w:ascii="Arial" w:hAnsi="Arial" w:eastAsia="Yu Mincho" w:cs="Arial"/>
+          <w:color w:val="5B6573"/>
+          <w:sz w:val="17"/>
+          <w:szCs w:val="17"/>
+          <w:rtl/>
+          <w:cs/>
+          <w:lang w:val="ar-SA" w:bidi="ar-SA"/>
+        </w:rPr>
+        <w:t>Paragraph direction, run direction, logical alignment, digits, punctuation, and embedded Latin are combined.</w:t>
+      </w:r>
+    </w:p>
+    <w:p>
+      <w:pPr>
+        <w:bidi/>
+        <w:spacing w:before="0" w:after="180" w:line="360" w:lineRule="auto"/>
+        <w:ind w:right="360"/>
+        <w:jc w:val="right"/>
+      </w:pPr>
+      <w:r>
+        <w:rPr>
+          <w:rFonts w:ascii="Arial" w:hAnsi="Arial" w:eastAsia="Yu Mincho" w:cs="Arial"/>
+          <w:sz w:val="28"/>
+          <w:szCs w:val="28"/>
+          <w:rtl/>
+          <w:cs/>
+          <w:lang w:val="ar-SA" w:bidi="ar-SA"/>
+        </w:rPr>
+        <w:t xml:space="preserve">هذا نص عربي للاختبار: </w:t>
+      </w:r>
+      <w:r>
+        <w:rPr>
+          <w:rFonts w:ascii="Arial" w:hAnsi="Arial" w:eastAsia="Yu Mincho" w:cs="Arial"/>
+          <w:sz w:val="28"/>
+          <w:szCs w:val="28"/>
+          <w:rtl/>
+          <w:cs/>
+          <w:lang w:val="ar-SA" w:bidi="ar-SA"/>
+        </w:rPr>
+        <w:t xml:space="preserve">(2026) </w:t>
+      </w:r>
+      <w:r>
+        <w:rPr>
+          <w:rFonts w:ascii="Arial" w:hAnsi="Arial" w:eastAsia="Yu Mincho" w:cs="Arial"/>
+          <w:color w:val="2A7F8E"/>
+          <w:sz w:val="28"/>
+          <w:szCs w:val="28"/>
+          <w:lang w:val="en-US" w:eastAsia="en-US"/>
+        </w:rPr>
+        <w:t>Office-XML</w:t>
+      </w:r>
+      <w:r>
+        <w:rPr>
+          <w:rFonts w:ascii="Arial" w:hAnsi="Arial" w:eastAsia="Yu Mincho" w:cs="Arial"/>
+          <w:sz w:val="28"/>
+          <w:szCs w:val="28"/>
+          <w:rtl/>
+          <w:cs/>
+          <w:lang w:val="ar-SA" w:bidi="ar-SA"/>
+        </w:rPr>
+        <w:t xml:space="preserve"> — هل تظهر الأقواس والترقيم في مواضعها؟</w:t>
+      </w:r>
+    </w:p>
+    <w:p>
+      <w:pPr>
+        <w:bidi/>
+        <w:spacing w:before="0" w:after="200" w:line="360" w:lineRule="auto"/>
+        <w:ind w:right="360"/>
+        <w:jc w:val="right"/>
+      </w:pPr>
+      <w:r>
+        <w:rPr>
+          <w:rFonts w:ascii="Arial" w:hAnsi="Arial" w:eastAsia="Yu Mincho" w:cs="Arial"/>
+          <w:sz w:val="28"/>
+          <w:szCs w:val="28"/>
+          <w:rtl/>
+          <w:cs/>
+          <w:lang w:val="he-IL" w:bidi="he-IL"/>
+        </w:rPr>
+        <w:t xml:space="preserve">טקסט עברי משולב </w:t>
+      </w:r>
+      <w:r>
+        <w:rPr>
+          <w:rFonts w:ascii="Arial" w:hAnsi="Arial" w:eastAsia="Yu Mincho" w:cs="Arial"/>
+          <w:color w:val="2A7F8E"/>
+          <w:sz w:val="28"/>
+          <w:szCs w:val="28"/>
+          <w:lang w:val="en-US" w:eastAsia="en-US"/>
+        </w:rPr>
+        <w:t xml:space="preserve">ABC 123 </w:t>
+      </w:r>
+      <w:r>
+        <w:rPr>
+          <w:rFonts w:ascii="Arial" w:hAnsi="Arial" w:eastAsia="Yu Mincho" w:cs="Arial"/>
+          <w:sz w:val="28"/>
+          <w:szCs w:val="28"/>
+          <w:rtl/>
+          <w:cs/>
+          <w:lang w:val="he-IL" w:bidi="he-IL"/>
+        </w:rPr>
+        <w:t>וסימני פיסוק: (סוגריים) [סוגריים מרובעים].</w:t>
+      </w:r>
+    </w:p>
+    <w:p>
+      <w:pPr>
+        <w:keepNext/>
+        <w:bidi/>
+        <w:spacing w:before="160" w:after="100" w:line="276" w:lineRule="auto"/>
+        <w:jc w:val="right"/>
+      </w:pPr>
+      <w:r>
+        <w:rPr>
+          <w:rFonts w:ascii="Arial" w:hAnsi="Arial" w:eastAsia="Yu Mincho" w:cs="Arial"/>
+          <w:b/>
+          <w:bCs/>
+          <w:color w:val="FFFFFF"/>
+          <w:sz w:val="17"/>
+          <w:szCs w:val="17"/>
+          <w:rtl/>
+          <w:cs/>
+          <w:lang w:val="ar-SA" w:bidi="ar-SA"/>
+          <w:shd w:fill="2A7F8E" w:val="clear"/>
+        </w:rPr>
+        <w:t>D-RTL-003</w:t>
+      </w:r>
+      <w:r>
+        <w:rPr>
+          <w:rFonts w:ascii="Arial" w:hAnsi="Arial" w:eastAsia="Yu Mincho" w:cs="Arial"/>
+          <w:sz w:val="17"/>
+          <w:szCs w:val="17"/>
+          <w:rtl/>
+          <w:cs/>
+          <w:lang w:val="ar-SA" w:bidi="ar-SA"/>
+        </w:rPr>
+        <w:t xml:space="preserve">   </w:t>
+      </w:r>
+      <w:r>
+        <w:rPr>
+          <w:rFonts w:ascii="Arial" w:hAnsi="Arial" w:eastAsia="Yu Mincho" w:cs="Arial"/>
+          <w:b/>
+          <w:bCs/>
+          <w:color w:val="17324D"/>
+          <w:sz w:val="21"/>
+          <w:szCs w:val="21"/>
+          <w:rtl/>
+          <w:cs/>
+          <w:lang w:val="ar-SA" w:bidi="ar-SA"/>
+        </w:rPr>
+        <w:t>RTL tab stops and logical start/end placement</w:t>
+      </w:r>
+    </w:p>
+    <w:p>
+      <w:pPr>
+        <w:tabs>
+          <w:tab w:val="right" w:pos="1440"/>
+          <w:tab w:val="center" w:pos="4320"/>
+          <w:tab w:val="left" w:pos="7200"/>
+        </w:tabs>
+        <w:bidi/>
+        <w:spacing w:before="0" w:after="200" w:line="276" w:lineRule="auto"/>
+        <w:jc w:val="right"/>
+      </w:pPr>
+      <w:r>
+        <w:rPr>
+          <w:rFonts w:ascii="Arial" w:hAnsi="Arial" w:eastAsia="Yu Mincho" w:cs="Arial"/>
+          <w:sz w:val="26"/>
+          <w:szCs w:val="26"/>
+          <w:rtl/>
+          <w:cs/>
+          <w:lang w:val="ar-SA" w:bidi="ar-SA"/>
+        </w:rPr>
+        <w:t>بداية</w:t>
+      </w:r>
+      <w:r>
+        <w:rPr>
+          <w:rFonts w:ascii="Arial" w:hAnsi="Arial" w:eastAsia="Yu Mincho" w:cs="Arial"/>
+          <w:sz w:val="26"/>
+          <w:szCs w:val="26"/>
+          <w:rtl/>
+          <w:cs/>
+          <w:lang w:val="ar-SA" w:bidi="ar-SA"/>
+        </w:rPr>
+        <w:tab/>
+      </w:r>
+      <w:r>
+        <w:rPr>
+          <w:rFonts w:ascii="Arial" w:hAnsi="Arial" w:eastAsia="Yu Mincho" w:cs="Arial"/>
+          <w:sz w:val="26"/>
+          <w:szCs w:val="26"/>
+          <w:rtl/>
+          <w:cs/>
+          <w:lang w:val="ar-SA" w:bidi="ar-SA"/>
+        </w:rPr>
+        <w:t>وسط 123</w:t>
+      </w:r>
+      <w:r>
+        <w:rPr>
+          <w:rFonts w:ascii="Arial" w:hAnsi="Arial" w:eastAsia="Yu Mincho" w:cs="Arial"/>
+          <w:sz w:val="26"/>
+          <w:szCs w:val="26"/>
+          <w:rtl/>
+          <w:cs/>
+          <w:lang w:val="ar-SA" w:bidi="ar-SA"/>
+        </w:rPr>
+        <w:tab/>
+      </w:r>
+      <w:r>
+        <w:rPr>
+          <w:rFonts w:ascii="Arial" w:hAnsi="Arial" w:eastAsia="Yu Mincho" w:cs="Arial"/>
+          <w:sz w:val="26"/>
+          <w:szCs w:val="26"/>
+          <w:rtl/>
+          <w:cs/>
+          <w:lang w:val="ar-SA" w:bidi="ar-SA"/>
+        </w:rPr>
+        <w:t>نهاية ABC</w:t>
+      </w:r>
+    </w:p>
+    <w:p>
+      <w:pPr>
+        <w:keepNext/>
+        <w:bidi/>
+        <w:spacing w:before="160" w:after="100" w:line="276" w:lineRule="auto"/>
+        <w:jc w:val="right"/>
+      </w:pPr>
+      <w:r>
+        <w:rPr>
+          <w:rFonts w:ascii="Arial" w:hAnsi="Arial" w:eastAsia="Yu Mincho" w:cs="Arial"/>
+          <w:b/>
+          <w:bCs/>
+          <w:color w:val="FFFFFF"/>
+          <w:sz w:val="17"/>
+          <w:szCs w:val="17"/>
+          <w:rtl/>
+          <w:cs/>
+          <w:lang w:val="ar-SA" w:bidi="ar-SA"/>
+          <w:shd w:fill="2A7F8E" w:val="clear"/>
+        </w:rPr>
+        <w:t>D-RTL-004</w:t>
+      </w:r>
+      <w:r>
+        <w:rPr>
+          <w:rFonts w:ascii="Arial" w:hAnsi="Arial" w:eastAsia="Yu Mincho" w:cs="Arial"/>
+          <w:sz w:val="17"/>
+          <w:szCs w:val="17"/>
+          <w:rtl/>
+          <w:cs/>
+          <w:lang w:val="ar-SA" w:bidi="ar-SA"/>
+        </w:rPr>
+        <w:t xml:space="preserve">   </w:t>
+      </w:r>
+      <w:r>
+        <w:rPr>
+          <w:rFonts w:ascii="Arial" w:hAnsi="Arial" w:eastAsia="Yu Mincho" w:cs="Arial"/>
+          <w:b/>
+          <w:bCs/>
+          <w:color w:val="17324D"/>
+          <w:sz w:val="21"/>
+          <w:szCs w:val="21"/>
+          <w:rtl/>
+          <w:cs/>
+          <w:lang w:val="ar-SA" w:bidi="ar-SA"/>
+        </w:rPr>
+        <w:t>RTL fitText regions: multi-run and single-glyph</w:t>
+      </w:r>
+    </w:p>
+    <w:p>
+      <w:pPr>
+        <w:bidi/>
+        <w:spacing w:before="0" w:after="200" w:line="360" w:lineRule="auto"/>
+        <w:ind w:right="720"/>
+        <w:jc w:val="right"/>
+      </w:pPr>
+      <w:r>
+        <w:rPr>
+          <w:rFonts w:ascii="Arial" w:hAnsi="Arial" w:eastAsia="Yu Mincho" w:cs="Arial"/>
+          <w:sz w:val="24"/>
+          <w:szCs w:val="24"/>
+          <w:rtl/>
+          <w:cs/>
+          <w:lang w:val="ar-SA" w:bidi="ar-SA"/>
+        </w:rPr>
+        <w:t xml:space="preserve">منطقة متعددة: </w:t>
+      </w:r>
+      <w:r>
+        <w:rPr>
+          <w:rFonts w:ascii="Arial" w:hAnsi="Arial" w:eastAsia="Yu Mincho" w:cs="Arial"/>
+          <w:color w:val="2A7F8E"/>
+          <w:sz w:val="28"/>
+          <w:szCs w:val="28"/>
+          <w:fitText w:val="2400" w:id="41"/>
+          <w:rtl/>
+          <w:cs/>
+          <w:lang w:val="ar-SA" w:bidi="ar-SA"/>
+        </w:rPr>
+        <w:t>أب</w:t>
+      </w:r>
+      <w:r>
+        <w:rPr>
+          <w:rFonts w:ascii="Arial" w:hAnsi="Arial" w:eastAsia="Yu Mincho" w:cs="Arial"/>
+          <w:color w:val="2A7F8E"/>
+          <w:sz w:val="28"/>
+          <w:szCs w:val="28"/>
+          <w:fitText w:val="2400" w:id="41"/>
+          <w:rtl/>
+          <w:cs/>
+          <w:lang w:val="ar-SA" w:bidi="ar-SA"/>
+        </w:rPr>
+        <w:t>جد</w:t>
+      </w:r>
+      <w:r>
+        <w:rPr>
+          <w:rFonts w:ascii="Arial" w:hAnsi="Arial" w:eastAsia="Yu Mincho" w:cs="Arial"/>
+          <w:sz w:val="24"/>
+          <w:szCs w:val="24"/>
+          <w:rtl/>
+          <w:cs/>
+          <w:lang w:val="ar-SA" w:bidi="ar-SA"/>
+        </w:rPr>
+        <w:t xml:space="preserve">  |  حرف واحد: </w:t>
+      </w:r>
+      <w:r>
+        <w:rPr>
+          <w:rFonts w:ascii="Arial" w:hAnsi="Arial" w:eastAsia="Yu Mincho" w:cs="Arial"/>
+          <w:color w:val="2A7F8E"/>
+          <w:sz w:val="28"/>
+          <w:szCs w:val="28"/>
+          <w:fitText w:val="2400" w:id="42"/>
+          <w:rtl/>
+          <w:cs/>
+          <w:lang w:val="ar-SA" w:bidi="ar-SA"/>
+        </w:rPr>
+        <w:t>س</w:t>
+      </w:r>
+    </w:p>
+    <w:p>
+      <w:pPr>
+        <w:spacing w:before="0" w:after="0" w:line="276" w:lineRule="auto"/>
+      </w:pPr>
+      <w:r>
+        <w:rPr>
+          <w:rFonts w:ascii="Arial" w:hAnsi="Arial" w:eastAsia="Yu Mincho" w:cs="Arial"/>
+          <w:sz w:val="22"/>
+          <w:szCs w:val="22"/>
+        </w:rPr>
+        <w:br w:type="page"/>
+      </w:r>
+    </w:p>
+    <w:p>
+      <w:pPr>
+        <w:keepNext/>
+        <w:bidi/>
+        <w:spacing w:before="160" w:after="100" w:line="276" w:lineRule="auto"/>
+        <w:jc w:val="right"/>
+      </w:pPr>
+      <w:r>
+        <w:rPr>
+          <w:rFonts w:ascii="Arial" w:hAnsi="Arial" w:eastAsia="Yu Mincho" w:cs="Arial"/>
+          <w:b/>
+          <w:bCs/>
+          <w:color w:val="FFFFFF"/>
+          <w:sz w:val="17"/>
+          <w:szCs w:val="17"/>
+          <w:rtl/>
+          <w:cs/>
+          <w:lang w:val="ar-SA" w:bidi="ar-SA"/>
+          <w:shd w:fill="2A7F8E" w:val="clear"/>
+        </w:rPr>
+        <w:t>D-RTL-005</w:t>
+      </w:r>
+      <w:r>
+        <w:rPr>
+          <w:rFonts w:ascii="Arial" w:hAnsi="Arial" w:eastAsia="Yu Mincho" w:cs="Arial"/>
+          <w:sz w:val="17"/>
+          <w:szCs w:val="17"/>
+          <w:rtl/>
+          <w:cs/>
+          <w:lang w:val="ar-SA" w:bidi="ar-SA"/>
+        </w:rPr>
+        <w:t xml:space="preserve">   </w:t>
+      </w:r>
+      <w:r>
+        <w:rPr>
+          <w:rFonts w:ascii="Arial" w:hAnsi="Arial" w:eastAsia="Yu Mincho" w:cs="Arial"/>
+          <w:b/>
+          <w:bCs/>
+          <w:color w:val="17324D"/>
+          <w:sz w:val="21"/>
+          <w:szCs w:val="21"/>
+          <w:rtl/>
+          <w:cs/>
+          <w:lang w:val="ar-SA" w:bidi="ar-SA"/>
+        </w:rPr>
+        <w:t>Arabic justification: low, medium, and high Kashida</w:t>
+      </w:r>
+    </w:p>
+    <w:p>
+      <w:pPr>
+        <w:bidi/>
+        <w:spacing w:before="0" w:after="260" w:line="380" w:lineRule="auto"/>
+        <w:ind w:left="360" w:right="360"/>
+        <w:jc w:val="lowKashida"/>
+      </w:pPr>
+      <w:r>
+        <w:rPr>
+          <w:rFonts w:ascii="Arial" w:hAnsi="Arial" w:eastAsia="Yu Mincho" w:cs="Arial"/>
+          <w:b/>
+          <w:bCs/>
+          <w:color w:val="2A7F8E"/>
+          <w:sz w:val="20"/>
+          <w:szCs w:val="20"/>
+          <w:rtl/>
+          <w:cs/>
+          <w:lang w:val="ar-SA" w:bidi="ar-SA"/>
+        </w:rPr>
+        <w:t xml:space="preserve">lowKashida: </w:t>
+      </w:r>
+      <w:r>
+        <w:rPr>
+          <w:rFonts w:ascii="Arial" w:hAnsi="Arial" w:eastAsia="Yu Mincho" w:cs="Arial"/>
+          <w:sz w:val="28"/>
+          <w:szCs w:val="28"/>
+          <w:rtl/>
+          <w:cs/>
+          <w:lang w:val="ar-SA" w:bidi="ar-SA"/>
+        </w:rPr>
+        <w:t>تختبر هذه الفقرة توزيع الكلمات العربية واستطالة الحروف على السطر بصورة قابلة للمقارنة</w:t>
+      </w:r>
+      <w:r>
+        <w:rPr>
+          <w:rFonts w:ascii="Arial" w:hAnsi="Arial" w:eastAsia="Yu Mincho" w:cs="Arial"/>
+          <w:sz w:val="28"/>
+          <w:szCs w:val="28"/>
+          <w:rtl/>
+          <w:cs/>
+          <w:lang w:val="ar-SA" w:bidi="ar-SA"/>
+        </w:rPr>
+        <w:br/>
+      </w:r>
+      <w:r>
+        <w:rPr>
+          <w:rFonts w:ascii="Arial" w:hAnsi="Arial" w:eastAsia="Yu Mincho" w:cs="Arial"/>
+          <w:sz w:val="28"/>
+          <w:szCs w:val="28"/>
+          <w:rtl/>
+          <w:cs/>
+          <w:lang w:val="ar-SA" w:bidi="ar-SA"/>
+        </w:rPr>
+        <w:t>سطر نهائي قصير</w:t>
+      </w:r>
+    </w:p>
+    <w:p>
+      <w:pPr>
+        <w:bidi/>
+        <w:spacing w:before="0" w:after="260" w:line="380" w:lineRule="auto"/>
+        <w:ind w:left="360" w:right="360"/>
+        <w:jc w:val="mediumKashida"/>
+      </w:pPr>
+      <w:r>
+        <w:rPr>
+          <w:rFonts w:ascii="Arial" w:hAnsi="Arial" w:eastAsia="Yu Mincho" w:cs="Arial"/>
+          <w:b/>
+          <w:bCs/>
+          <w:color w:val="2A7F8E"/>
+          <w:sz w:val="20"/>
+          <w:szCs w:val="20"/>
+          <w:rtl/>
+          <w:cs/>
+          <w:lang w:val="ar-SA" w:bidi="ar-SA"/>
+        </w:rPr>
+        <w:t xml:space="preserve">mediumKashida: </w:t>
+      </w:r>
+      <w:r>
+        <w:rPr>
+          <w:rFonts w:ascii="Arial" w:hAnsi="Arial" w:eastAsia="Yu Mincho" w:cs="Arial"/>
+          <w:sz w:val="28"/>
+          <w:szCs w:val="28"/>
+          <w:rtl/>
+          <w:cs/>
+          <w:lang w:val="ar-SA" w:bidi="ar-SA"/>
+        </w:rPr>
+        <w:t>تختبر هذه الفقرة توزيع الكلمات العربية واستطالة الحروف على السطر بصورة قابلة للمقارنة</w:t>
+      </w:r>
+      <w:r>
+        <w:rPr>
+          <w:rFonts w:ascii="Arial" w:hAnsi="Arial" w:eastAsia="Yu Mincho" w:cs="Arial"/>
+          <w:sz w:val="28"/>
+          <w:szCs w:val="28"/>
+          <w:rtl/>
+          <w:cs/>
+          <w:lang w:val="ar-SA" w:bidi="ar-SA"/>
+        </w:rPr>
+        <w:br/>
+      </w:r>
+      <w:r>
+        <w:rPr>
+          <w:rFonts w:ascii="Arial" w:hAnsi="Arial" w:eastAsia="Yu Mincho" w:cs="Arial"/>
+          <w:sz w:val="28"/>
+          <w:szCs w:val="28"/>
+          <w:rtl/>
+          <w:cs/>
+          <w:lang w:val="ar-SA" w:bidi="ar-SA"/>
+        </w:rPr>
+        <w:t>سطر نهائي قصير</w:t>
+      </w:r>
+    </w:p>
+    <w:p>
+      <w:pPr>
+        <w:bidi/>
+        <w:spacing w:before="0" w:after="260" w:line="380" w:lineRule="auto"/>
+        <w:ind w:left="360" w:right="360"/>
+        <w:jc w:val="highKashida"/>
+      </w:pPr>
+      <w:r>
+        <w:rPr>
+          <w:rFonts w:ascii="Arial" w:hAnsi="Arial" w:eastAsia="Yu Mincho" w:cs="Arial"/>
+          <w:b/>
+          <w:bCs/>
+          <w:color w:val="2A7F8E"/>
+          <w:sz w:val="20"/>
+          <w:szCs w:val="20"/>
+          <w:rtl/>
+          <w:cs/>
+          <w:lang w:val="ar-SA" w:bidi="ar-SA"/>
+        </w:rPr>
+        <w:t xml:space="preserve">highKashida: </w:t>
+      </w:r>
+      <w:r>
+        <w:rPr>
+          <w:rFonts w:ascii="Arial" w:hAnsi="Arial" w:eastAsia="Yu Mincho" w:cs="Arial"/>
+          <w:sz w:val="28"/>
+          <w:szCs w:val="28"/>
+          <w:rtl/>
+          <w:cs/>
+          <w:lang w:val="ar-SA" w:bidi="ar-SA"/>
+        </w:rPr>
+        <w:t>تختبر هذه الفقرة توزيع الكلمات العربية واستطالة الحروف على السطر بصورة قابلة للمقارنة</w:t>
+      </w:r>
+      <w:r>
+        <w:rPr>
+          <w:rFonts w:ascii="Arial" w:hAnsi="Arial" w:eastAsia="Yu Mincho" w:cs="Arial"/>
+          <w:sz w:val="28"/>
+          <w:szCs w:val="28"/>
+          <w:rtl/>
+          <w:cs/>
+          <w:lang w:val="ar-SA" w:bidi="ar-SA"/>
+        </w:rPr>
+        <w:br/>
+      </w:r>
+      <w:r>
+        <w:rPr>
+          <w:rFonts w:ascii="Arial" w:hAnsi="Arial" w:eastAsia="Yu Mincho" w:cs="Arial"/>
+          <w:sz w:val="28"/>
+          <w:szCs w:val="28"/>
+          <w:rtl/>
+          <w:cs/>
+          <w:lang w:val="ar-SA" w:bidi="ar-SA"/>
+        </w:rPr>
+        <w:t>سطر نهائي قصير</w:t>
+      </w:r>
+    </w:p>
+    <w:p>
+      <w:pPr>
+        <w:sectPr>
+          <w:type w:val="nextPage"/>
+          <w:pgSz w:w="12240" w:h="15840"/>
+          <w:pgMar w:top="1152" w:right="1440" w:bottom="1152" w:left="1440" w:header="648" w:footer="648" w:gutter="0"/>
+          <w:cols w:space="360" w:num="1"/>
+          <w:bidi/>
+          <w:rtlGutter/>
+          <w:docGrid w:type="linesAndChars" w:linePitch="360" w:charSpace="0"/>
+          <w:pgBorders w:offsetFrom="page" w:display="allPages" w:zOrder="back">
+            <w:top w:val="single" w:sz="6" w:space="20" w:color="CAD3DA"/>
+            <w:left w:val="single" w:sz="6" w:space="20" w:color="CAD3DA"/>
+            <w:bottom w:val="single" w:sz="6" w:space="20" w:color="CAD3DA"/>
+            <w:right w:val="single" w:sz="6" w:space="20" w:color="CAD3DA"/>
+          </w:pgBorders>
+        </w:sectPr>
+      </w:pPr>
+    </w:p>
+    <w:p>
+      <w:pPr>
+        <w:keepNext/>
+        <w:spacing w:before="160" w:after="100" w:line="276" w:lineRule="auto"/>
+      </w:pPr>
+      <w:r>
+        <w:rPr>
+          <w:rFonts w:ascii="Arial" w:hAnsi="Arial" w:eastAsia="Yu Mincho" w:cs="Arial"/>
+          <w:b/>
+          <w:color w:val="FFFFFF"/>
+          <w:sz w:val="17"/>
+          <w:szCs w:val="17"/>
+          <w:shd w:fill="2A7F8E" w:val="clear"/>
+        </w:rPr>
+        <w:t>D-SPACE-002</w:t>
+      </w:r>
+      <w:r>
+        <w:rPr>
+          <w:rFonts w:ascii="Arial" w:hAnsi="Arial" w:eastAsia="Yu Mincho" w:cs="Arial"/>
+          <w:sz w:val="17"/>
+          <w:szCs w:val="17"/>
+        </w:rPr>
+        <w:t xml:space="preserve">   </w:t>
+      </w:r>
+      <w:r>
+        <w:rPr>
+          <w:rFonts w:ascii="Arial" w:hAnsi="Arial" w:eastAsia="Yu Mincho" w:cs="Arial"/>
+          <w:b/>
+          <w:color w:val="17324D"/>
+          <w:sz w:val="21"/>
+          <w:szCs w:val="21"/>
+        </w:rPr>
+        <w:t>contextualSpacing: one-sided and two-sided adjacency</w:t>
+      </w:r>
+    </w:p>
+    <w:p>
+      <w:pPr>
+        <w:spacing w:before="0" w:after="100" w:line="276" w:lineRule="auto"/>
+      </w:pPr>
+      <w:r>
+        <w:rPr>
+          <w:rFonts w:ascii="Arial" w:hAnsi="Arial" w:eastAsia="Yu Mincho" w:cs="Arial"/>
+          <w:color w:val="5B6573"/>
+          <w:sz w:val="17"/>
+          <w:szCs w:val="17"/>
+          <w:lang w:val="en-US" w:eastAsia="en-US"/>
+        </w:rPr>
+        <w:t>Each pair uses the same paragraph style and 12 pt after-spacing; only the contextualSpacing flags differ.</w:t>
+      </w:r>
+    </w:p>
+    <w:p>
+      <w:pPr>
+        <w:pStyle w:val="BodyText"/>
+        <w:spacing w:before="0" w:after="240" w:line="276" w:lineRule="auto"/>
+        <w:contextualSpacing/>
+        <w:shd w:fill="F5F8FA" w:val="clear"/>
+      </w:pPr>
+      <w:r>
+        <w:rPr>
+          <w:rFonts w:ascii="Arial" w:hAnsi="Arial" w:eastAsia="Yu Mincho" w:cs="Arial"/>
+          <w:color w:val="17324D"/>
+          <w:sz w:val="20"/>
+          <w:szCs w:val="20"/>
+        </w:rPr>
+        <w:t>A: first only — first paragraph</w:t>
+      </w:r>
+    </w:p>
+    <w:p>
+      <w:pPr>
+        <w:pStyle w:val="BodyText"/>
+        <w:spacing w:before="0" w:after="240" w:line="276" w:lineRule="auto"/>
+        <w:shd w:fill="EAF3F5" w:val="clear"/>
+      </w:pPr>
+      <w:r>
+        <w:rPr>
+          <w:rFonts w:ascii="Arial" w:hAnsi="Arial" w:eastAsia="Yu Mincho" w:cs="Arial"/>
+          <w:color w:val="17324D"/>
+          <w:sz w:val="20"/>
+          <w:szCs w:val="20"/>
+        </w:rPr>
+        <w:t>A: first only — second paragraph</w:t>
+      </w:r>
+    </w:p>
+    <w:p>
+      <w:pPr>
+        <w:pStyle w:val="BodyText"/>
+        <w:spacing w:before="0" w:after="240" w:line="276" w:lineRule="auto"/>
+        <w:shd w:fill="F5F8FA" w:val="clear"/>
+      </w:pPr>
+      <w:r>
+        <w:rPr>
+          <w:rFonts w:ascii="Arial" w:hAnsi="Arial" w:eastAsia="Yu Mincho" w:cs="Arial"/>
+          <w:color w:val="17324D"/>
+          <w:sz w:val="20"/>
+          <w:szCs w:val="20"/>
+        </w:rPr>
+        <w:t>B: second only — first paragraph</w:t>
+      </w:r>
+    </w:p>
+    <w:p>
+      <w:pPr>
+        <w:pStyle w:val="BodyText"/>
+        <w:spacing w:before="0" w:after="240" w:line="276" w:lineRule="auto"/>
+        <w:contextualSpacing/>
+        <w:shd w:fill="EAF3F5" w:val="clear"/>
+      </w:pPr>
+      <w:r>
+        <w:rPr>
+          <w:rFonts w:ascii="Arial" w:hAnsi="Arial" w:eastAsia="Yu Mincho" w:cs="Arial"/>
+          <w:color w:val="17324D"/>
+          <w:sz w:val="20"/>
+          <w:szCs w:val="20"/>
+        </w:rPr>
+        <w:t>B: second only — second paragraph</w:t>
+      </w:r>
+    </w:p>
+    <w:p>
+      <w:pPr>
+        <w:pStyle w:val="BodyText"/>
+        <w:spacing w:before="0" w:after="240" w:line="276" w:lineRule="auto"/>
+        <w:contextualSpacing/>
+        <w:shd w:fill="F5F8FA" w:val="clear"/>
+      </w:pPr>
+      <w:r>
+        <w:rPr>
+          <w:rFonts w:ascii="Arial" w:hAnsi="Arial" w:eastAsia="Yu Mincho" w:cs="Arial"/>
+          <w:color w:val="17324D"/>
+          <w:sz w:val="20"/>
+          <w:szCs w:val="20"/>
+        </w:rPr>
+        <w:t>C: both — first paragraph</w:t>
+      </w:r>
+    </w:p>
+    <w:p>
+      <w:pPr>
+        <w:pStyle w:val="BodyText"/>
+        <w:spacing w:before="0" w:after="240" w:line="276" w:lineRule="auto"/>
+        <w:contextualSpacing/>
+        <w:shd w:fill="EAF3F5" w:val="clear"/>
+      </w:pPr>
+      <w:r>
+        <w:rPr>
+          <w:rFonts w:ascii="Arial" w:hAnsi="Arial" w:eastAsia="Yu Mincho" w:cs="Arial"/>
+          <w:color w:val="17324D"/>
+          <w:sz w:val="20"/>
+          <w:szCs w:val="20"/>
+        </w:rPr>
+        <w:t>C: both — second paragraph</w:t>
+      </w:r>
+    </w:p>
+    <w:p>
+      <w:pPr>
+        <w:keepNext/>
+        <w:spacing w:before="160" w:after="100" w:line="276" w:lineRule="auto"/>
+      </w:pPr>
+      <w:r>
+        <w:rPr>
+          <w:rFonts w:ascii="Arial" w:hAnsi="Arial" w:eastAsia="Yu Mincho" w:cs="Arial"/>
+          <w:b/>
+          <w:color w:val="FFFFFF"/>
+          <w:sz w:val="17"/>
+          <w:szCs w:val="17"/>
+          <w:shd w:fill="2A7F8E" w:val="clear"/>
+        </w:rPr>
+        <w:t>D-LINE-002</w:t>
+      </w:r>
+      <w:r>
+        <w:rPr>
+          <w:rFonts w:ascii="Arial" w:hAnsi="Arial" w:eastAsia="Yu Mincho" w:cs="Arial"/>
+          <w:sz w:val="17"/>
+          <w:szCs w:val="17"/>
+        </w:rPr>
+        <w:t xml:space="preserve">   </w:t>
+      </w:r>
+      <w:r>
+        <w:rPr>
+          <w:rFonts w:ascii="Arial" w:hAnsi="Arial" w:eastAsia="Yu Mincho" w:cs="Arial"/>
+          <w:b/>
+          <w:color w:val="17324D"/>
+          <w:sz w:val="21"/>
+          <w:szCs w:val="21"/>
+        </w:rPr>
+        <w:t>Automatic line spacing at 1.0×, 1.5×, and 2.0×</w:t>
+      </w:r>
+    </w:p>
+    <w:p>
+      <w:pPr>
+        <w:spacing w:before="0" w:after="120" w:line="240" w:lineRule="auto"/>
+      </w:pPr>
+      <w:r>
+        <w:rPr>
+          <w:rFonts w:ascii="Arial" w:hAnsi="Arial" w:eastAsia="Yu Mincho" w:cs="Arial"/>
+          <w:sz w:val="24"/>
+          <w:szCs w:val="24"/>
+        </w:rPr>
+        <w:t>1.0×: Agjp العربية 日本語 — first line</w:t>
+      </w:r>
+      <w:r>
+        <w:rPr>
+          <w:rFonts w:ascii="Arial" w:hAnsi="Arial" w:eastAsia="Yu Mincho" w:cs="Arial"/>
+          <w:sz w:val="24"/>
+          <w:szCs w:val="24"/>
+        </w:rPr>
+        <w:br/>
+      </w:r>
+      <w:r>
+        <w:rPr>
+          <w:rFonts w:ascii="Arial" w:hAnsi="Arial" w:eastAsia="Yu Mincho" w:cs="Arial"/>
+          <w:sz w:val="24"/>
+          <w:szCs w:val="24"/>
+        </w:rPr>
+        <w:t>second line keeps the baseline model comparable.</w:t>
+      </w:r>
+    </w:p>
+    <w:p>
+      <w:pPr>
+        <w:spacing w:before="0" w:after="120" w:line="360" w:lineRule="auto"/>
+      </w:pPr>
+      <w:r>
+        <w:rPr>
+          <w:rFonts w:ascii="Arial" w:hAnsi="Arial" w:eastAsia="Yu Mincho" w:cs="Arial"/>
+          <w:sz w:val="24"/>
+          <w:szCs w:val="24"/>
+        </w:rPr>
+        <w:t>1.5×: Agjp العربية 日本語 — first line</w:t>
+      </w:r>
+      <w:r>
+        <w:rPr>
+          <w:rFonts w:ascii="Arial" w:hAnsi="Arial" w:eastAsia="Yu Mincho" w:cs="Arial"/>
+          <w:sz w:val="24"/>
+          <w:szCs w:val="24"/>
+        </w:rPr>
+        <w:br/>
+      </w:r>
+      <w:r>
+        <w:rPr>
+          <w:rFonts w:ascii="Arial" w:hAnsi="Arial" w:eastAsia="Yu Mincho" w:cs="Arial"/>
+          <w:sz w:val="24"/>
+          <w:szCs w:val="24"/>
+        </w:rPr>
+        <w:t>second line keeps the baseline model comparable.</w:t>
+      </w:r>
+    </w:p>
+    <w:p>
+      <w:pPr>
+        <w:spacing w:before="0" w:after="120" w:line="480" w:lineRule="auto"/>
+      </w:pPr>
+      <w:r>
+        <w:rPr>
+          <w:rFonts w:ascii="Arial" w:hAnsi="Arial" w:eastAsia="Yu Mincho" w:cs="Arial"/>
+          <w:sz w:val="24"/>
+          <w:szCs w:val="24"/>
+        </w:rPr>
+        <w:t>2.0×: Agjp العربية 日本語 — first line</w:t>
+      </w:r>
+      <w:r>
+        <w:rPr>
+          <w:rFonts w:ascii="Arial" w:hAnsi="Arial" w:eastAsia="Yu Mincho" w:cs="Arial"/>
+          <w:sz w:val="24"/>
+          <w:szCs w:val="24"/>
+        </w:rPr>
+        <w:br/>
+      </w:r>
+      <w:r>
+        <w:rPr>
+          <w:rFonts w:ascii="Arial" w:hAnsi="Arial" w:eastAsia="Yu Mincho" w:cs="Arial"/>
+          <w:sz w:val="24"/>
+          <w:szCs w:val="24"/>
+        </w:rPr>
+        <w:t>second line keeps the baseline model comparable.</w:t>
+      </w:r>
+    </w:p>
+    <w:p>
+      <w:pPr>
+        <w:spacing w:before="0" w:after="0" w:line="276" w:lineRule="auto"/>
+      </w:pPr>
+      <w:r>
+        <w:rPr>
+          <w:rFonts w:ascii="Arial" w:hAnsi="Arial" w:eastAsia="Yu Mincho" w:cs="Arial"/>
+          <w:sz w:val="22"/>
+          <w:szCs w:val="22"/>
+        </w:rPr>
+        <w:br w:type="page"/>
+      </w:r>
+    </w:p>
+    <w:p>
+      <w:pPr>
+        <w:keepNext/>
+        <w:spacing w:before="160" w:after="100" w:line="276" w:lineRule="auto"/>
+      </w:pPr>
+      <w:r>
+        <w:rPr>
+          <w:rFonts w:ascii="Arial" w:hAnsi="Arial" w:eastAsia="Yu Mincho" w:cs="Arial"/>
+          <w:b/>
+          <w:color w:val="FFFFFF"/>
+          <w:sz w:val="17"/>
+          <w:szCs w:val="17"/>
+          <w:shd w:fill="2A7F8E" w:val="clear"/>
+        </w:rPr>
+        <w:t>D-THAI-001</w:t>
+      </w:r>
+      <w:r>
+        <w:rPr>
+          <w:rFonts w:ascii="Arial" w:hAnsi="Arial" w:eastAsia="Yu Mincho" w:cs="Arial"/>
+          <w:sz w:val="17"/>
+          <w:szCs w:val="17"/>
+        </w:rPr>
+        <w:t xml:space="preserve">   </w:t>
+      </w:r>
+      <w:r>
+        <w:rPr>
+          <w:rFonts w:ascii="Arial" w:hAnsi="Arial" w:eastAsia="Yu Mincho" w:cs="Arial"/>
+          <w:b/>
+          <w:color w:val="17324D"/>
+          <w:sz w:val="21"/>
+          <w:szCs w:val="21"/>
+        </w:rPr>
+        <w:t>Thai distributed justification with mixed numerals</w:t>
+      </w:r>
+    </w:p>
+    <w:p>
+      <w:pPr>
+        <w:spacing w:before="0" w:after="220" w:line="360" w:lineRule="auto"/>
+        <w:ind w:left="360" w:right="360"/>
+        <w:jc w:val="thaiDistribute"/>
+      </w:pPr>
+      <w:r>
+        <w:rPr>
+          <w:rFonts w:ascii="Tahoma" w:hAnsi="Tahoma" w:eastAsia="Tahoma" w:cs="Tahoma"/>
+          <w:sz w:val="26"/>
+          <w:szCs w:val="26"/>
+          <w:lang w:val="th-TH" w:eastAsia="th-TH"/>
+        </w:rPr>
+        <w:t>ภาษาไทยสำหรับทดสอบการกระจายข้อความในบรรทัดเดียวกัน โดยมีตัวเลข 123 และคำภาษาอังกฤษ Office อยู่ร่วมกัน</w:t>
+      </w:r>
+      <w:r>
+        <w:rPr>
+          <w:rFonts w:ascii="Arial" w:hAnsi="Arial" w:eastAsia="Yu Mincho" w:cs="Arial"/>
+          <w:sz w:val="26"/>
+          <w:szCs w:val="26"/>
+        </w:rPr>
+        <w:br/>
+      </w:r>
+      <w:r>
+        <w:rPr>
+          <w:rFonts w:ascii="Tahoma" w:hAnsi="Tahoma" w:eastAsia="Tahoma" w:cs="Tahoma"/>
+          <w:sz w:val="26"/>
+          <w:szCs w:val="26"/>
+          <w:lang w:val="th-TH" w:eastAsia="th-TH"/>
+        </w:rPr>
+        <w:t>บรรทัดสุดท้ายสั้น</w:t>
+      </w:r>
+    </w:p>
+    <w:p>
+      <w:pPr>
+        <w:keepNext/>
+        <w:spacing w:before="160" w:after="100" w:line="276" w:lineRule="auto"/>
+      </w:pPr>
+      <w:r>
+        <w:rPr>
+          <w:rFonts w:ascii="Arial" w:hAnsi="Arial" w:eastAsia="Yu Mincho" w:cs="Arial"/>
+          <w:b/>
+          <w:color w:val="FFFFFF"/>
+          <w:sz w:val="17"/>
+          <w:szCs w:val="17"/>
+          <w:shd w:fill="2A7F8E" w:val="clear"/>
+        </w:rPr>
+        <w:t>D-TABLE-004</w:t>
+      </w:r>
+      <w:r>
+        <w:rPr>
+          <w:rFonts w:ascii="Arial" w:hAnsi="Arial" w:eastAsia="Yu Mincho" w:cs="Arial"/>
+          <w:sz w:val="17"/>
+          <w:szCs w:val="17"/>
+        </w:rPr>
+        <w:t xml:space="preserve">   </w:t>
+      </w:r>
+      <w:r>
+        <w:rPr>
+          <w:rFonts w:ascii="Arial" w:hAnsi="Arial" w:eastAsia="Yu Mincho" w:cs="Arial"/>
+          <w:b/>
+          <w:color w:val="17324D"/>
+          <w:sz w:val="21"/>
+          <w:szCs w:val="21"/>
+        </w:rPr>
+        <w:t>Segmented border conflict across a merged cell</w:t>
+      </w:r>
+    </w:p>
+    <w:p>
+      <w:pPr>
+        <w:spacing w:before="0" w:after="100" w:line="276" w:lineRule="auto"/>
+      </w:pPr>
+      <w:r>
+        <w:rPr>
+          <w:rFonts w:ascii="Arial" w:hAnsi="Arial" w:eastAsia="Yu Mincho" w:cs="Arial"/>
+          <w:color w:val="5B6573"/>
+          <w:sz w:val="17"/>
+          <w:szCs w:val="17"/>
+          <w:lang w:val="en-US" w:eastAsia="en-US"/>
+        </w:rPr>
+        <w:t>Three upper cells meet one gridSpan=3 lower cell; the shared edge has competing width, style, and color.</w:t>
+      </w:r>
+    </w:p>
+    <w:tbl>
+      <w:tblPr>
+        <w:tblW w:type="dxa" w:w="9000"/>
+        <w:tblLayout w:type="fixed"/>
+      </w:tblPr>
+      <w:tblGrid>
+        <w:gridCol w:w="3000"/>
+        <w:gridCol w:w="3000"/>
+        <w:gridCol w:w="3000"/>
+      </w:tblGrid>
+      <w:tr>
+        <w:tc>
+          <w:tcPr>
+            <w:tcW w:type="dxa" w:w="3000"/>
+            <w:tcBorders>
+              <w:bottom w:val="single" w:sz="10" w:space="0" w:color="C94343"/>
+            </w:tcBorders>
+            <w:shd w:fill="F5F8FA" w:val="clear"/>
+          </w:tcPr>
+          <w:p>
+            <w:pPr>
+              <w:spacing w:before="0" w:after="80" w:line="276" w:lineRule="auto"/>
+              <w:jc w:val="center"/>
+            </w:pPr>
+            <w:r>
+              <w:rPr>
+                <w:rFonts w:ascii="Arial" w:hAnsi="Arial" w:eastAsia="Yu Mincho" w:cs="Arial"/>
+                <w:b/>
+                <w:color w:val="17324D"/>
+                <w:sz w:val="18"/>
+                <w:szCs w:val="18"/>
+              </w:rPr>
+              <w:t>A</w:t>
+            </w:r>
+          </w:p>
+        </w:tc>
+        <w:tc>
+          <w:tcPr>
+            <w:tcW w:type="dxa" w:w="3000"/>
+            <w:tcBorders>
+              <w:bottom w:val="single" w:sz="10" w:space="0" w:color="2D8C62"/>
+            </w:tcBorders>
+            <w:shd w:fill="F5F8FA" w:val="clear"/>
+          </w:tcPr>
+          <w:p>
+            <w:pPr>
+              <w:spacing w:before="0" w:after="80" w:line="276" w:lineRule="auto"/>
+              <w:jc w:val="center"/>
+            </w:pPr>
+            <w:r>
+              <w:rPr>
+                <w:rFonts w:ascii="Arial" w:hAnsi="Arial" w:eastAsia="Yu Mincho" w:cs="Arial"/>
+                <w:b/>
+                <w:color w:val="17324D"/>
+                <w:sz w:val="18"/>
+                <w:szCs w:val="18"/>
+              </w:rPr>
+              <w:t>B</w:t>
+            </w:r>
+          </w:p>
+        </w:tc>
+        <w:tc>
+          <w:tcPr>
+            <w:tcW w:type="dxa" w:w="3000"/>
+            <w:tcBorders>
+              <w:bottom w:val="single" w:sz="10" w:space="0" w:color="356CB6"/>
+            </w:tcBorders>
+            <w:shd w:fill="F5F8FA" w:val="clear"/>
+          </w:tcPr>
+          <w:p>
+            <w:pPr>
+              <w:spacing w:before="0" w:after="80" w:line="276" w:lineRule="auto"/>
+              <w:jc w:val="center"/>
+            </w:pPr>
+            <w:r>
+              <w:rPr>
+                <w:rFonts w:ascii="Arial" w:hAnsi="Arial" w:eastAsia="Yu Mincho" w:cs="Arial"/>
+                <w:b/>
+                <w:color w:val="17324D"/>
+                <w:sz w:val="18"/>
+                <w:szCs w:val="18"/>
+              </w:rPr>
+              <w:t>C</w:t>
+            </w:r>
+          </w:p>
+        </w:tc>
+      </w:tr>
+      <w:tr>
+        <w:tc>
+          <w:tcPr>
+            <w:tcW w:type="dxa" w:w="9000"/>
+            <w:gridSpan w:val="3"/>
+            <w:tcBorders>
+              <w:top w:val="double" w:sz="18" w:space="0" w:color="17324D"/>
+            </w:tcBorders>
+            <w:shd w:fill="EAF3F5" w:val="clear"/>
+          </w:tcPr>
+          <w:p>
+            <w:pPr>
+              <w:spacing w:before="0" w:after="80" w:line="276" w:lineRule="auto"/>
+              <w:jc w:val="center"/>
+            </w:pPr>
+            <w:r>
+              <w:rPr>
+                <w:rFonts w:ascii="Arial" w:hAnsi="Arial" w:eastAsia="Yu Mincho" w:cs="Arial"/>
+                <w:b/>
+                <w:color w:val="17324D"/>
+                <w:sz w:val="18"/>
+                <w:szCs w:val="18"/>
+              </w:rPr>
+              <w:t>gridSpan=3 against three independently bordered neighbors</w:t>
+            </w:r>
+          </w:p>
+        </w:tc>
+      </w:tr>
+    </w:tbl>
     <w:sectPr>
-      <w:headerReference w:type="default" r:id="rId27"/>
-      <w:headerReference w:type="first" r:id="rId28"/>
-      <w:headerReference w:type="even" r:id="rId29"/>
-      <w:footerReference w:type="default" r:id="rId30"/>
       <w:pgSz w:w="12240" w:h="15840"/>
       <w:pgMar w:top="1152" w:right="1440" w:bottom="1152" w:left="1440" w:header="648" w:footer="648" w:gutter="0"/>
-      <w:cols w:space="360" w:num="1" w:sep="1"/>
-      <w:titlePg/>
-      <w:docGrid w:linePitch="360" w:type="linesAndChars" w:charSpace="0"/>
-      <w:lnNumType w:countBy="1" w:start="1" w:distance="360" w:restart="newPage"/>
-      <w:pgNumType w:start="1" w:fmt="lowerRoman"/>
+      <w:cols w:space="360" w:num="1"/>
+      <w:docGrid w:type="linesAndChars" w:linePitch="360" w:charSpace="0"/>
       <w:pgBorders w:offsetFrom="page" w:display="allPages" w:zOrder="back">
         <w:top w:val="single" w:sz="6" w:space="20" w:color="CAD3DA"/>
         <w:left w:val="single" w:sz="6" w:space="20" w:color="CAD3DA"/>

</xml_diff>

<commit_message>
test(docx): retain recent layout regression classes
Extend the redistributable DOCX corpus with synthetic cases for full-width punctuation advance, adjacent underline phase, numbering justification, mathematical alphabet variants, markup fallback, vertically merged table pagination, and nested quarter-turn group transforms.

The cases reduce observed Office compatibility failures to public-safe invariants without publishing private source material. Existing fixture pages remain layout-stable apart from updated document-wide page fields and endnote relocation to the new terminus.

Co-Authored-By: Codex GPT-5.6 Sol <noreply@openai.com>
</commit_message>
<xml_diff>
--- a/packages/docx/public/demo/test-1.docx
+++ b/packages/docx/public/demo/test-1.docx
@@ -5692,6 +5692,2171 @@
         </w:tc>
       </w:tr>
     </w:tbl>
+    <w:p>
+      <w:r>
+        <w:br w:type="page"/>
+      </w:r>
+    </w:p>
+    <w:p>
+      <w:pPr>
+        <w:pStyle w:val="Heading1"/>
+      </w:pPr>
+      <w:r>
+        <w:t>Retained text geometry regressions</w:t>
+      </w:r>
+    </w:p>
+    <w:p>
+      <w:pPr>
+        <w:keepNext/>
+        <w:spacing w:before="160" w:after="100" w:line="276" w:lineRule="auto"/>
+      </w:pPr>
+      <w:r>
+        <w:rPr>
+          <w:rFonts w:ascii="Arial" w:hAnsi="Arial" w:eastAsia="Yu Mincho" w:cs="Arial"/>
+          <w:b/>
+          <w:color w:val="FFFFFF"/>
+          <w:sz w:val="17"/>
+          <w:shd w:val="clear" w:fill="2A7F8E"/>
+        </w:rPr>
+        <w:t>D-PUNCT-002</w:t>
+      </w:r>
+      <w:r>
+        <w:rPr>
+          <w:rFonts w:ascii="Arial" w:hAnsi="Arial" w:eastAsia="Yu Mincho" w:cs="Arial"/>
+          <w:b w:val="0"/>
+          <w:color w:val="17324D"/>
+          <w:sz w:val="17"/>
+        </w:rPr>
+        <w:t xml:space="preserve">   </w:t>
+      </w:r>
+      <w:r>
+        <w:rPr>
+          <w:rFonts w:ascii="Arial" w:hAnsi="Arial" w:eastAsia="Yu Mincho" w:cs="Arial"/>
+          <w:b/>
+          <w:color w:val="17324D"/>
+          <w:sz w:val="21"/>
+        </w:rPr>
+        <w:t>Horizontal full-width punctuation keeps visible advance</w:t>
+      </w:r>
+    </w:p>
+    <w:p>
+      <w:pPr>
+        <w:spacing w:after="100" w:line="276" w:lineRule="auto"/>
+      </w:pPr>
+      <w:r>
+        <w:rPr>
+          <w:rFonts w:ascii="Arial" w:hAnsi="Arial" w:eastAsia="Yu Mincho" w:cs="Arial"/>
+          <w:b w:val="0"/>
+          <w:color w:val="5B6573"/>
+          <w:sz w:val="17"/>
+        </w:rPr>
+        <w:t>Each pair must retain readable spacing without overlap, including the closing punctuation that may compress at a line boundary.</w:t>
+      </w:r>
+    </w:p>
+    <w:tbl>
+      <w:tblPr>
+        <w:tblStyle w:val="TableGrid"/>
+        <w:tblLook w:firstColumn="1" w:firstRow="1" w:lastColumn="0" w:lastRow="0" w:noHBand="0" w:noVBand="1" w:val="04A0"/>
+        <w:tblW w:type="dxa" w:w="9360"/>
+        <w:tblInd w:type="dxa" w:w="120"/>
+        <w:tblLayout w:type="fixed"/>
+        <w:tblCellMar>
+          <w:top w:type="dxa" w:w="80"/>
+          <w:start w:type="dxa" w:w="120"/>
+          <w:bottom w:type="dxa" w:w="80"/>
+          <w:end w:type="dxa" w:w="120"/>
+        </w:tblCellMar>
+      </w:tblPr>
+      <w:tblGrid>
+        <w:gridCol w:w="2016"/>
+        <w:gridCol w:w="7344"/>
+      </w:tblGrid>
+      <w:tr>
+        <w:tc>
+          <w:tcPr>
+            <w:tcW w:type="dxa" w:w="2016"/>
+            <w:shd w:val="clear" w:fill="E8EEF5"/>
+            <w:vAlign w:val="center"/>
+          </w:tcPr>
+          <w:p>
+            <w:r>
+              <w:rPr>
+                <w:rFonts w:ascii="Arial" w:hAnsi="Arial" w:eastAsia="Yu Mincho" w:cs="Arial"/>
+                <w:b/>
+                <w:color w:val="17324D"/>
+                <w:sz w:val="18"/>
+              </w:rPr>
+              <w:t>Case</w:t>
+            </w:r>
+          </w:p>
+        </w:tc>
+        <w:tc>
+          <w:tcPr>
+            <w:tcW w:type="dxa" w:w="7344"/>
+            <w:shd w:val="clear" w:fill="E8EEF5"/>
+            <w:vAlign w:val="center"/>
+          </w:tcPr>
+          <w:p>
+            <w:r>
+              <w:rPr>
+                <w:rFonts w:ascii="Arial" w:hAnsi="Arial" w:eastAsia="Yu Mincho" w:cs="Arial"/>
+                <w:b/>
+                <w:color w:val="17324D"/>
+                <w:sz w:val="18"/>
+              </w:rPr>
+              <w:t>Synthetic sequence</w:t>
+            </w:r>
+          </w:p>
+        </w:tc>
+      </w:tr>
+      <w:tr>
+        <w:tc>
+          <w:tcPr>
+            <w:tcW w:type="dxa" w:w="2016"/>
+            <w:vAlign w:val="center"/>
+          </w:tcPr>
+          <w:p>
+            <w:r>
+              <w:rPr>
+                <w:rFonts w:ascii="Arial" w:hAnsi="Arial" w:eastAsia="Yu Mincho" w:cs="Arial"/>
+                <w:b w:val="0"/>
+                <w:color w:val="17324D"/>
+                <w:sz w:val="20"/>
+              </w:rPr>
+              <w:t>Middle dot</w:t>
+            </w:r>
+          </w:p>
+        </w:tc>
+        <w:tc>
+          <w:tcPr>
+            <w:tcW w:type="dxa" w:w="7344"/>
+            <w:vAlign w:val="center"/>
+          </w:tcPr>
+          <w:p>
+            <w:r>
+              <w:rPr>
+                <w:rFonts w:ascii="Arial" w:hAnsi="Arial" w:eastAsia="Yu Mincho" w:cs="Arial"/>
+                <w:b w:val="0"/>
+                <w:color w:val="17324D"/>
+                <w:sz w:val="20"/>
+              </w:rPr>
+              <w:t>通勤・通学等</w:t>
+            </w:r>
+          </w:p>
+        </w:tc>
+      </w:tr>
+      <w:tr>
+        <w:tc>
+          <w:tcPr>
+            <w:tcW w:type="dxa" w:w="2016"/>
+            <w:vAlign w:val="center"/>
+          </w:tcPr>
+          <w:p>
+            <w:r>
+              <w:rPr>
+                <w:rFonts w:ascii="Arial" w:hAnsi="Arial" w:eastAsia="Yu Mincho" w:cs="Arial"/>
+                <w:b w:val="0"/>
+                <w:color w:val="17324D"/>
+                <w:sz w:val="20"/>
+              </w:rPr>
+              <w:t>Comma</w:t>
+            </w:r>
+          </w:p>
+        </w:tc>
+        <w:tc>
+          <w:tcPr>
+            <w:tcW w:type="dxa" w:w="7344"/>
+            <w:vAlign w:val="center"/>
+          </w:tcPr>
+          <w:p>
+            <w:r>
+              <w:rPr>
+                <w:rFonts w:ascii="Arial" w:hAnsi="Arial" w:eastAsia="Yu Mincho" w:cs="Arial"/>
+                <w:b w:val="0"/>
+                <w:color w:val="17324D"/>
+                <w:sz w:val="20"/>
+              </w:rPr>
+              <w:t>反応後、透明な液体</w:t>
+            </w:r>
+          </w:p>
+        </w:tc>
+      </w:tr>
+      <w:tr>
+        <w:tc>
+          <w:tcPr>
+            <w:tcW w:type="dxa" w:w="2016"/>
+            <w:vAlign w:val="center"/>
+          </w:tcPr>
+          <w:p>
+            <w:r>
+              <w:rPr>
+                <w:rFonts w:ascii="Arial" w:hAnsi="Arial" w:eastAsia="Yu Mincho" w:cs="Arial"/>
+                <w:b w:val="0"/>
+                <w:color w:val="17324D"/>
+                <w:sz w:val="20"/>
+              </w:rPr>
+              <w:t>Full-width colon</w:t>
+            </w:r>
+          </w:p>
+        </w:tc>
+        <w:tc>
+          <w:tcPr>
+            <w:tcW w:type="dxa" w:w="7344"/>
+            <w:vAlign w:val="center"/>
+          </w:tcPr>
+          <w:p>
+            <w:r>
+              <w:rPr>
+                <w:rFonts w:ascii="Arial" w:hAnsi="Arial" w:eastAsia="Yu Mincho" w:cs="Arial"/>
+                <w:b w:val="0"/>
+                <w:color w:val="17324D"/>
+                <w:sz w:val="20"/>
+              </w:rPr>
+              <w:t>E-mail：alpha@example.test</w:t>
+            </w:r>
+          </w:p>
+        </w:tc>
+      </w:tr>
+      <w:tr>
+        <w:tc>
+          <w:tcPr>
+            <w:tcW w:type="dxa" w:w="2016"/>
+            <w:vAlign w:val="center"/>
+          </w:tcPr>
+          <w:p>
+            <w:r>
+              <w:rPr>
+                <w:rFonts w:ascii="Arial" w:hAnsi="Arial" w:eastAsia="Yu Mincho" w:cs="Arial"/>
+                <w:b w:val="0"/>
+                <w:color w:val="17324D"/>
+                <w:sz w:val="20"/>
+              </w:rPr>
+              <w:t>Closing marks</w:t>
+            </w:r>
+          </w:p>
+        </w:tc>
+        <w:tc>
+          <w:tcPr>
+            <w:tcW w:type="dxa" w:w="7344"/>
+            <w:vAlign w:val="center"/>
+          </w:tcPr>
+          <w:p>
+            <w:r>
+              <w:rPr>
+                <w:rFonts w:ascii="Arial" w:hAnsi="Arial" w:eastAsia="Yu Mincho" w:cs="Arial"/>
+                <w:b w:val="0"/>
+                <w:color w:val="17324D"/>
+                <w:sz w:val="20"/>
+              </w:rPr>
+              <w:t>確認）次　引用」次　句点。次</w:t>
+            </w:r>
+          </w:p>
+        </w:tc>
+      </w:tr>
+      <w:tr>
+        <w:tc>
+          <w:tcPr>
+            <w:tcW w:type="dxa" w:w="2016"/>
+            <w:vAlign w:val="center"/>
+          </w:tcPr>
+          <w:p>
+            <w:r>
+              <w:rPr>
+                <w:rFonts w:ascii="Arial" w:hAnsi="Arial" w:eastAsia="Yu Mincho" w:cs="Arial"/>
+                <w:b w:val="0"/>
+                <w:color w:val="17324D"/>
+                <w:sz w:val="20"/>
+              </w:rPr>
+              <w:t>Emphasis</w:t>
+            </w:r>
+          </w:p>
+        </w:tc>
+        <w:tc>
+          <w:tcPr>
+            <w:tcW w:type="dxa" w:w="7344"/>
+            <w:vAlign w:val="center"/>
+          </w:tcPr>
+          <w:p>
+            <w:r>
+              <w:rPr>
+                <w:rFonts w:ascii="Arial" w:hAnsi="Arial" w:eastAsia="Yu Mincho" w:cs="Arial"/>
+                <w:b w:val="0"/>
+                <w:color w:val="17324D"/>
+                <w:sz w:val="20"/>
+              </w:rPr>
+              <w:t>注意！次　質問？次</w:t>
+            </w:r>
+          </w:p>
+        </w:tc>
+      </w:tr>
+    </w:tbl>
+    <w:p>
+      <w:pPr>
+        <w:keepNext/>
+        <w:spacing w:before="160" w:after="100" w:line="276" w:lineRule="auto"/>
+      </w:pPr>
+      <w:r>
+        <w:rPr>
+          <w:rFonts w:ascii="Arial" w:hAnsi="Arial" w:eastAsia="Yu Mincho" w:cs="Arial"/>
+          <w:b/>
+          <w:color w:val="FFFFFF"/>
+          <w:sz w:val="17"/>
+          <w:shd w:val="clear" w:fill="2A7F8E"/>
+        </w:rPr>
+        <w:t>D-UNDERLINE-002</w:t>
+      </w:r>
+      <w:r>
+        <w:rPr>
+          <w:rFonts w:ascii="Arial" w:hAnsi="Arial" w:eastAsia="Yu Mincho" w:cs="Arial"/>
+          <w:b w:val="0"/>
+          <w:color w:val="17324D"/>
+          <w:sz w:val="17"/>
+        </w:rPr>
+        <w:t xml:space="preserve">   </w:t>
+      </w:r>
+      <w:r>
+        <w:rPr>
+          <w:rFonts w:ascii="Arial" w:hAnsi="Arial" w:eastAsia="Yu Mincho" w:cs="Arial"/>
+          <w:b/>
+          <w:color w:val="17324D"/>
+          <w:sz w:val="21"/>
+        </w:rPr>
+        <w:t>Adjacent dotted and wavy runs keep one continuous phase</w:t>
+      </w:r>
+    </w:p>
+    <w:p>
+      <w:pPr>
+        <w:spacing w:after="80"/>
+      </w:pPr>
+      <w:r>
+        <w:rPr>
+          <w:rFonts w:ascii="Arial" w:hAnsi="Arial" w:eastAsia="Yu Mincho" w:cs="Arial"/>
+          <w:b/>
+          <w:color w:val="5B6573"/>
+          <w:sz w:val="19"/>
+        </w:rPr>
+        <w:t xml:space="preserve">Dotted: </w:t>
+      </w:r>
+      <w:r>
+        <w:rPr>
+          <w:rFonts w:ascii="Arial" w:hAnsi="Arial" w:eastAsia="Yu Mincho" w:cs="Arial"/>
+          <w:b w:val="0"/>
+          <w:color w:val="17324D"/>
+          <w:sz w:val="22"/>
+          <w:u w:val="dotted"/>
+        </w:rPr>
+        <w:t>フリ</w:t>
+      </w:r>
+      <w:r>
+        <w:rPr>
+          <w:rFonts w:ascii="Arial" w:hAnsi="Arial" w:eastAsia="Yu Mincho" w:cs="Arial"/>
+          <w:b w:val="0"/>
+          <w:color w:val="17324D"/>
+          <w:sz w:val="22"/>
+          <w:u w:val="dotted"/>
+        </w:rPr>
+        <w:t>ガ</w:t>
+      </w:r>
+      <w:r>
+        <w:rPr>
+          <w:rFonts w:ascii="Arial" w:hAnsi="Arial" w:eastAsia="Yu Mincho" w:cs="Arial"/>
+          <w:b w:val="0"/>
+          <w:color w:val="17324D"/>
+          <w:sz w:val="22"/>
+          <w:u w:val="dotted"/>
+        </w:rPr>
+        <w:t>ナ</w:t>
+      </w:r>
+    </w:p>
+    <w:p>
+      <w:pPr>
+        <w:spacing w:after="80"/>
+      </w:pPr>
+      <w:r>
+        <w:rPr>
+          <w:rFonts w:ascii="Arial" w:hAnsi="Arial" w:eastAsia="Yu Mincho" w:cs="Arial"/>
+          <w:b/>
+          <w:color w:val="5B6573"/>
+          <w:sz w:val="19"/>
+        </w:rPr>
+        <w:t xml:space="preserve">Wavy: </w:t>
+      </w:r>
+      <w:r>
+        <w:rPr>
+          <w:rFonts w:ascii="Arial" w:hAnsi="Arial" w:eastAsia="Yu Mincho" w:cs="Arial"/>
+          <w:b w:val="0"/>
+          <w:color w:val="17324D"/>
+          <w:sz w:val="22"/>
+          <w:u w:val="wave"/>
+        </w:rPr>
+        <w:t>continuous</w:t>
+      </w:r>
+      <w:r>
+        <w:rPr>
+          <w:rFonts w:ascii="Arial" w:hAnsi="Arial" w:eastAsia="Yu Mincho" w:cs="Arial"/>
+          <w:b w:val="0"/>
+          <w:color w:val="17324D"/>
+          <w:sz w:val="22"/>
+          <w:u w:val="wave"/>
+        </w:rPr>
+        <w:t xml:space="preserve"> wave</w:t>
+      </w:r>
+      <w:r>
+        <w:rPr>
+          <w:rFonts w:ascii="Arial" w:hAnsi="Arial" w:eastAsia="Yu Mincho" w:cs="Arial"/>
+          <w:b w:val="0"/>
+          <w:color w:val="17324D"/>
+          <w:sz w:val="22"/>
+          <w:u w:val="wave"/>
+        </w:rPr>
+        <w:t xml:space="preserve"> across runs</w:t>
+      </w:r>
+    </w:p>
+    <w:p>
+      <w:pPr>
+        <w:keepNext/>
+        <w:spacing w:before="160" w:after="100" w:line="276" w:lineRule="auto"/>
+      </w:pPr>
+      <w:r>
+        <w:rPr>
+          <w:rFonts w:ascii="Arial" w:hAnsi="Arial" w:eastAsia="Yu Mincho" w:cs="Arial"/>
+          <w:b/>
+          <w:color w:val="FFFFFF"/>
+          <w:sz w:val="17"/>
+          <w:shd w:val="clear" w:fill="2A7F8E"/>
+        </w:rPr>
+        <w:t>D-LIST-002</w:t>
+      </w:r>
+      <w:r>
+        <w:rPr>
+          <w:rFonts w:ascii="Arial" w:hAnsi="Arial" w:eastAsia="Yu Mincho" w:cs="Arial"/>
+          <w:b w:val="0"/>
+          <w:color w:val="17324D"/>
+          <w:sz w:val="17"/>
+        </w:rPr>
+        <w:t xml:space="preserve">   </w:t>
+      </w:r>
+      <w:r>
+        <w:rPr>
+          <w:rFonts w:ascii="Arial" w:hAnsi="Arial" w:eastAsia="Yu Mincho" w:cs="Arial"/>
+          <w:b/>
+          <w:color w:val="17324D"/>
+          <w:sz w:val="21"/>
+        </w:rPr>
+        <w:t>Marker justification, centered composites, and invisible levels</w:t>
+      </w:r>
+    </w:p>
+    <w:p>
+      <w:pPr>
+        <w:numPr>
+          <w:ilvl w:val="0"/>
+          <w:numId w:val="12"/>
+        </w:numPr>
+        <w:jc w:val="center"/>
+      </w:pPr>
+      <w:r>
+        <w:t>Centered marker and body form one interval.</w:t>
+      </w:r>
+    </w:p>
+    <w:p>
+      <w:pPr>
+        <w:numPr>
+          <w:ilvl w:val="0"/>
+          <w:numId w:val="13"/>
+        </w:numPr>
+        <w:jc w:val="center"/>
+      </w:pPr>
+      <w:r>
+        <w:t>Centered body with an intentionally invisible number level.</w:t>
+      </w:r>
+    </w:p>
+    <w:p>
+      <w:pPr>
+        <w:numPr>
+          <w:ilvl w:val="0"/>
+          <w:numId w:val="14"/>
+        </w:numPr>
+      </w:pPr>
+      <w:r>
+        <w:t>Narrow roman marker shares the same right edge.</w:t>
+      </w:r>
+    </w:p>
+    <w:p>
+      <w:pPr>
+        <w:numPr>
+          <w:ilvl w:val="0"/>
+          <w:numId w:val="14"/>
+        </w:numPr>
+      </w:pPr>
+      <w:r>
+        <w:t>Second marker advances without moving the body.</w:t>
+      </w:r>
+    </w:p>
+    <w:p>
+      <w:pPr>
+        <w:numPr>
+          <w:ilvl w:val="0"/>
+          <w:numId w:val="14"/>
+        </w:numPr>
+      </w:pPr>
+      <w:r>
+        <w:t>Third marker is wider but remains inside the hanging interval.</w:t>
+      </w:r>
+    </w:p>
+    <w:p>
+      <w:pPr>
+        <w:keepNext/>
+        <w:spacing w:before="160" w:after="100" w:line="276" w:lineRule="auto"/>
+      </w:pPr>
+      <w:r>
+        <w:rPr>
+          <w:rFonts w:ascii="Arial" w:hAnsi="Arial" w:eastAsia="Yu Mincho" w:cs="Arial"/>
+          <w:b/>
+          <w:color w:val="FFFFFF"/>
+          <w:sz w:val="17"/>
+          <w:shd w:val="clear" w:fill="2A7F8E"/>
+        </w:rPr>
+        <w:t>D-MATH-002</w:t>
+      </w:r>
+      <w:r>
+        <w:rPr>
+          <w:rFonts w:ascii="Arial" w:hAnsi="Arial" w:eastAsia="Yu Mincho" w:cs="Arial"/>
+          <w:b w:val="0"/>
+          <w:color w:val="17324D"/>
+          <w:sz w:val="17"/>
+        </w:rPr>
+        <w:t xml:space="preserve">   </w:t>
+      </w:r>
+      <w:r>
+        <w:rPr>
+          <w:rFonts w:ascii="Arial" w:hAnsi="Arial" w:eastAsia="Yu Mincho" w:cs="Arial"/>
+          <w:b/>
+          <w:color w:val="17324D"/>
+          <w:sz w:val="21"/>
+        </w:rPr>
+        <w:t>OMML Script, Fraktur, and Double-struck alphabets remain distinct</w:t>
+      </w:r>
+    </w:p>
+    <w:p>
+      <w:pPr>
+        <w:spacing w:after="80"/>
+      </w:pPr>
+      <w:r>
+        <w:rPr>
+          <w:rFonts w:ascii="Arial" w:hAnsi="Arial" w:eastAsia="Yu Mincho" w:cs="Arial"/>
+          <w:b/>
+          <w:color w:val="17324D"/>
+          <w:sz w:val="20"/>
+        </w:rPr>
+        <w:t xml:space="preserve">Script: </w:t>
+      </w:r>
+      <m:oMath>
+        <m:r>
+          <m:rPr>
+            <m:scr m:val="script"/>
+            <m:sty m:val="p"/>
+          </m:rPr>
+          <m:t>ABCxyz</m:t>
+        </m:r>
+      </m:oMath>
+      <w:r>
+        <w:rPr>
+          <w:rFonts w:ascii="Arial" w:hAnsi="Arial" w:eastAsia="Yu Mincho" w:cs="Arial"/>
+          <w:b w:val="0"/>
+          <w:color w:val="17324D"/>
+          <w:sz w:val="20"/>
+        </w:rPr>
+        <w:t xml:space="preserve">   </w:t>
+      </w:r>
+      <w:r>
+        <w:rPr>
+          <w:rFonts w:ascii="Arial" w:hAnsi="Arial" w:eastAsia="Yu Mincho" w:cs="Arial"/>
+          <w:b/>
+          <w:color w:val="17324D"/>
+          <w:sz w:val="20"/>
+        </w:rPr>
+        <w:t xml:space="preserve">Fraktur: </w:t>
+      </w:r>
+      <m:oMath>
+        <m:r>
+          <m:rPr>
+            <m:scr m:val="fraktur"/>
+            <m:sty m:val="p"/>
+          </m:rPr>
+          <m:t>ABCxyz</m:t>
+        </m:r>
+      </m:oMath>
+      <w:r>
+        <w:rPr>
+          <w:rFonts w:ascii="Arial" w:hAnsi="Arial" w:eastAsia="Yu Mincho" w:cs="Arial"/>
+          <w:b w:val="0"/>
+          <w:color w:val="17324D"/>
+          <w:sz w:val="20"/>
+        </w:rPr>
+        <w:t xml:space="preserve">   </w:t>
+      </w:r>
+      <w:r>
+        <w:rPr>
+          <w:rFonts w:ascii="Arial" w:hAnsi="Arial" w:eastAsia="Yu Mincho" w:cs="Arial"/>
+          <w:b/>
+          <w:color w:val="17324D"/>
+          <w:sz w:val="20"/>
+        </w:rPr>
+        <w:t xml:space="preserve">Double-struck: </w:t>
+      </w:r>
+      <m:oMath>
+        <m:r>
+          <m:rPr>
+            <m:scr m:val="double-struck"/>
+            <m:sty m:val="p"/>
+          </m:rPr>
+          <m:t>ABCxyz</m:t>
+        </m:r>
+      </m:oMath>
+      <w:r>
+        <w:rPr>
+          <w:rFonts w:ascii="Arial" w:hAnsi="Arial" w:eastAsia="Yu Mincho" w:cs="Arial"/>
+          <w:b w:val="0"/>
+          <w:color w:val="17324D"/>
+          <w:sz w:val="20"/>
+        </w:rPr>
+        <w:t xml:space="preserve">   </w:t>
+      </w:r>
+    </w:p>
+    <w:p>
+      <w:pPr>
+        <w:keepNext/>
+        <w:spacing w:before="160" w:after="100" w:line="276" w:lineRule="auto"/>
+      </w:pPr>
+      <w:r>
+        <w:rPr>
+          <w:rFonts w:ascii="Arial" w:hAnsi="Arial" w:eastAsia="Yu Mincho" w:cs="Arial"/>
+          <w:b/>
+          <w:color w:val="FFFFFF"/>
+          <w:sz w:val="17"/>
+          <w:shd w:val="clear" w:fill="2A7F8E"/>
+        </w:rPr>
+        <w:t>D-MCE-001</w:t>
+      </w:r>
+      <w:r>
+        <w:rPr>
+          <w:rFonts w:ascii="Arial" w:hAnsi="Arial" w:eastAsia="Yu Mincho" w:cs="Arial"/>
+          <w:b w:val="0"/>
+          <w:color w:val="17324D"/>
+          <w:sz w:val="17"/>
+        </w:rPr>
+        <w:t xml:space="preserve">   </w:t>
+      </w:r>
+      <w:r>
+        <w:rPr>
+          <w:rFonts w:ascii="Arial" w:hAnsi="Arial" w:eastAsia="Yu Mincho" w:cs="Arial"/>
+          <w:b/>
+          <w:color w:val="17324D"/>
+          <w:sz w:val="21"/>
+        </w:rPr>
+        <w:t>Unsupported markup selects the explicit fallback branch</w:t>
+      </w:r>
+    </w:p>
+    <w:p>
+      <mc:AlternateContent xmlns:future="urn:office-open-xml-viewer:unsupported-fixture">
+        <mc:Choice Requires="future">
+          <w:r>
+            <w:t>UNSUPPORTED CHOICE MUST NOT APPEAR</w:t>
+          </w:r>
+        </mc:Choice>
+        <mc:Fallback>
+          <w:r>
+            <w:rPr>
+              <w:b/>
+              <w:color w:val="17324D"/>
+            </w:rPr>
+            <w:t>Fallback branch visible</w:t>
+          </w:r>
+        </mc:Fallback>
+      </mc:AlternateContent>
+    </w:p>
+    <w:p>
+      <w:r>
+        <w:br w:type="page"/>
+      </w:r>
+    </w:p>
+    <w:p>
+      <w:pPr>
+        <w:pStyle w:val="Heading1"/>
+      </w:pPr>
+      <w:r>
+        <w:t>Merged-table pagination regression</w:t>
+      </w:r>
+    </w:p>
+    <w:p>
+      <w:pPr>
+        <w:keepNext/>
+        <w:spacing w:before="160" w:after="100" w:line="276" w:lineRule="auto"/>
+      </w:pPr>
+      <w:r>
+        <w:rPr>
+          <w:rFonts w:ascii="Arial" w:hAnsi="Arial" w:eastAsia="Yu Mincho" w:cs="Arial"/>
+          <w:b/>
+          <w:color w:val="FFFFFF"/>
+          <w:sz w:val="17"/>
+          <w:shd w:val="clear" w:fill="2A7F8E"/>
+        </w:rPr>
+        <w:t>D-TABLE-005</w:t>
+      </w:r>
+      <w:r>
+        <w:rPr>
+          <w:rFonts w:ascii="Arial" w:hAnsi="Arial" w:eastAsia="Yu Mincho" w:cs="Arial"/>
+          <w:b w:val="0"/>
+          <w:color w:val="17324D"/>
+          <w:sz w:val="17"/>
+        </w:rPr>
+        <w:t xml:space="preserve">   </w:t>
+      </w:r>
+      <w:r>
+        <w:rPr>
+          <w:rFonts w:ascii="Arial" w:hAnsi="Arial" w:eastAsia="Yu Mincho" w:cs="Arial"/>
+          <w:b/>
+          <w:color w:val="17324D"/>
+          <w:sz w:val="21"/>
+        </w:rPr>
+        <w:t>A vertical merge crosses a page boundary without double-charging owner content</w:t>
+      </w:r>
+    </w:p>
+    <w:p>
+      <w:pPr>
+        <w:spacing w:after="100" w:line="276" w:lineRule="auto"/>
+      </w:pPr>
+      <w:r>
+        <w:rPr>
+          <w:rFonts w:ascii="Arial" w:hAnsi="Arial" w:eastAsia="Yu Mincho" w:cs="Arial"/>
+          <w:b w:val="0"/>
+          <w:color w:val="5B6573"/>
+          <w:sz w:val="17"/>
+        </w:rPr>
+        <w:t>The first-column merge continues through every data row. Header repetition, row borders, and the final row must remain stable when the table paginates.</w:t>
+      </w:r>
+    </w:p>
+    <w:tbl>
+      <w:tblPr>
+        <w:tblStyle w:val="TableGrid"/>
+        <w:tblLook w:firstColumn="1" w:firstRow="1" w:lastColumn="0" w:lastRow="0" w:noHBand="0" w:noVBand="1" w:val="04A0"/>
+        <w:tblW w:type="dxa" w:w="9360"/>
+        <w:tblInd w:type="dxa" w:w="120"/>
+        <w:tblLayout w:type="fixed"/>
+        <w:tblCellMar>
+          <w:top w:type="dxa" w:w="80"/>
+          <w:start w:type="dxa" w:w="120"/>
+          <w:bottom w:type="dxa" w:w="80"/>
+          <w:end w:type="dxa" w:w="120"/>
+        </w:tblCellMar>
+      </w:tblPr>
+      <w:tblGrid>
+        <w:gridCol w:w="1800"/>
+        <w:gridCol w:w="1080"/>
+        <w:gridCol w:w="6480"/>
+      </w:tblGrid>
+      <w:tr>
+        <w:trPr>
+          <w:tblHeader w:val="true"/>
+        </w:trPr>
+        <w:tc>
+          <w:tcPr>
+            <w:tcW w:type="dxa" w:w="1800"/>
+            <w:shd w:val="clear" w:fill="E8EEF5"/>
+            <w:vAlign w:val="center"/>
+          </w:tcPr>
+          <w:p>
+            <w:r>
+              <w:rPr>
+                <w:rFonts w:ascii="Arial" w:hAnsi="Arial" w:eastAsia="Yu Mincho" w:cs="Arial"/>
+                <w:b/>
+                <w:color w:val="17324D"/>
+                <w:sz w:val="18"/>
+              </w:rPr>
+              <w:t>Merged owner</w:t>
+            </w:r>
+          </w:p>
+        </w:tc>
+        <w:tc>
+          <w:tcPr>
+            <w:tcW w:type="dxa" w:w="1080"/>
+            <w:shd w:val="clear" w:fill="E8EEF5"/>
+            <w:vAlign w:val="center"/>
+          </w:tcPr>
+          <w:p>
+            <w:r>
+              <w:rPr>
+                <w:rFonts w:ascii="Arial" w:hAnsi="Arial" w:eastAsia="Yu Mincho" w:cs="Arial"/>
+                <w:b/>
+                <w:color w:val="17324D"/>
+                <w:sz w:val="18"/>
+              </w:rPr>
+              <w:t>Track</w:t>
+            </w:r>
+          </w:p>
+        </w:tc>
+        <w:tc>
+          <w:tcPr>
+            <w:tcW w:type="dxa" w:w="6480"/>
+            <w:shd w:val="clear" w:fill="E8EEF5"/>
+            <w:vAlign w:val="center"/>
+          </w:tcPr>
+          <w:p>
+            <w:r>
+              <w:rPr>
+                <w:rFonts w:ascii="Arial" w:hAnsi="Arial" w:eastAsia="Yu Mincho" w:cs="Arial"/>
+                <w:b/>
+                <w:color w:val="17324D"/>
+                <w:sz w:val="18"/>
+              </w:rPr>
+              <w:t>Expected invariant</w:t>
+            </w:r>
+          </w:p>
+        </w:tc>
+      </w:tr>
+      <w:tr>
+        <w:trPr>
+          <w:trHeight w:val="700" w:hRule="atLeast"/>
+          <w:cantSplit/>
+        </w:trPr>
+        <w:tc>
+          <w:tcPr>
+            <w:tcW w:type="dxa" w:w="1800"/>
+            <w:vMerge w:val="restart"/>
+            <w:vAlign w:val="center"/>
+            <w:tcBorders>
+              <w:left w:val="single" w:sz="10" w:space="0" w:color="2A7F8E"/>
+            </w:tcBorders>
+          </w:tcPr>
+          <w:p>
+            <w:pPr>
+              <w:spacing w:after="0"/>
+            </w:pPr>
+            <w:r>
+              <w:rPr>
+                <w:rFonts w:ascii="Arial" w:hAnsi="Arial" w:eastAsia="Yu Mincho" w:cs="Arial"/>
+                <w:b w:val="0"/>
+                <w:color w:val="17324D"/>
+                <w:sz w:val="17"/>
+              </w:rPr>
+              <w:t>One retained vMerge owner</w:t>
+              <w:br/>
+              <w:t>across sixteen physical tracks</w:t>
+            </w:r>
+          </w:p>
+        </w:tc>
+        <w:tc>
+          <w:tcPr>
+            <w:tcW w:type="dxa" w:w="1080"/>
+            <w:vAlign w:val="center"/>
+          </w:tcPr>
+          <w:p>
+            <w:pPr>
+              <w:spacing w:after="0"/>
+            </w:pPr>
+            <w:r>
+              <w:rPr>
+                <w:rFonts w:ascii="Arial" w:hAnsi="Arial" w:eastAsia="Yu Mincho" w:cs="Arial"/>
+                <w:b w:val="0"/>
+                <w:color w:val="17324D"/>
+                <w:sz w:val="17"/>
+              </w:rPr>
+              <w:t>T-01</w:t>
+            </w:r>
+          </w:p>
+        </w:tc>
+        <w:tc>
+          <w:tcPr>
+            <w:tcW w:type="dxa" w:w="6480"/>
+            <w:vAlign w:val="center"/>
+            <w:tcBorders>
+              <w:right w:val="single" w:sz="10" w:space="0" w:color="2A7F8E"/>
+            </w:tcBorders>
+          </w:tcPr>
+          <w:p>
+            <w:pPr>
+              <w:spacing w:after="0"/>
+            </w:pPr>
+            <w:r>
+              <w:rPr>
+                <w:rFonts w:ascii="Arial" w:hAnsi="Arial" w:eastAsia="Yu Mincho" w:cs="Arial"/>
+                <w:b w:val="0"/>
+                <w:color w:val="17324D"/>
+                <w:sz w:val="17"/>
+              </w:rPr>
+              <w:t>Canonical track height is charged once; content and border remain inside this row.</w:t>
+            </w:r>
+          </w:p>
+        </w:tc>
+      </w:tr>
+      <w:tr>
+        <w:trPr>
+          <w:trHeight w:val="700" w:hRule="atLeast"/>
+          <w:cantSplit/>
+        </w:trPr>
+        <w:tc>
+          <w:tcPr>
+            <w:tcW w:type="dxa" w:w="3120"/>
+            <w:vMerge/>
+          </w:tcPr>
+          <w:p>
+            <w:r/>
+          </w:p>
+        </w:tc>
+        <w:tc>
+          <w:tcPr>
+            <w:tcW w:type="dxa" w:w="1080"/>
+            <w:vAlign w:val="center"/>
+            <w:shd w:val="clear" w:fill="F2F4F7"/>
+          </w:tcPr>
+          <w:p>
+            <w:pPr>
+              <w:spacing w:after="0"/>
+            </w:pPr>
+            <w:r>
+              <w:rPr>
+                <w:rFonts w:ascii="Arial" w:hAnsi="Arial" w:eastAsia="Yu Mincho" w:cs="Arial"/>
+                <w:b w:val="0"/>
+                <w:color w:val="17324D"/>
+                <w:sz w:val="17"/>
+              </w:rPr>
+              <w:t>T-02</w:t>
+            </w:r>
+          </w:p>
+        </w:tc>
+        <w:tc>
+          <w:tcPr>
+            <w:tcW w:type="dxa" w:w="6480"/>
+            <w:vAlign w:val="center"/>
+            <w:shd w:val="clear" w:fill="F2F4F7"/>
+            <w:tcBorders>
+              <w:right w:val="single" w:sz="10" w:space="0" w:color="2A7F8E"/>
+            </w:tcBorders>
+          </w:tcPr>
+          <w:p>
+            <w:pPr>
+              <w:spacing w:after="0"/>
+            </w:pPr>
+            <w:r>
+              <w:rPr>
+                <w:rFonts w:ascii="Arial" w:hAnsi="Arial" w:eastAsia="Yu Mincho" w:cs="Arial"/>
+                <w:b w:val="0"/>
+                <w:color w:val="17324D"/>
+                <w:sz w:val="17"/>
+              </w:rPr>
+              <w:t>Canonical track height is charged once; content and border remain inside this row.</w:t>
+            </w:r>
+          </w:p>
+        </w:tc>
+      </w:tr>
+      <w:tr>
+        <w:trPr>
+          <w:trHeight w:val="700" w:hRule="atLeast"/>
+          <w:cantSplit/>
+        </w:trPr>
+        <w:tc>
+          <w:tcPr>
+            <w:tcW w:type="dxa" w:w="3120"/>
+            <w:vMerge/>
+          </w:tcPr>
+          <w:p>
+            <w:r/>
+          </w:p>
+        </w:tc>
+        <w:tc>
+          <w:tcPr>
+            <w:tcW w:type="dxa" w:w="1080"/>
+            <w:vAlign w:val="center"/>
+          </w:tcPr>
+          <w:p>
+            <w:pPr>
+              <w:spacing w:after="0"/>
+            </w:pPr>
+            <w:r>
+              <w:rPr>
+                <w:rFonts w:ascii="Arial" w:hAnsi="Arial" w:eastAsia="Yu Mincho" w:cs="Arial"/>
+                <w:b w:val="0"/>
+                <w:color w:val="17324D"/>
+                <w:sz w:val="17"/>
+              </w:rPr>
+              <w:t>T-03</w:t>
+            </w:r>
+          </w:p>
+        </w:tc>
+        <w:tc>
+          <w:tcPr>
+            <w:tcW w:type="dxa" w:w="6480"/>
+            <w:vAlign w:val="center"/>
+            <w:tcBorders>
+              <w:right w:val="single" w:sz="10" w:space="0" w:color="2A7F8E"/>
+            </w:tcBorders>
+          </w:tcPr>
+          <w:p>
+            <w:pPr>
+              <w:spacing w:after="0"/>
+            </w:pPr>
+            <w:r>
+              <w:rPr>
+                <w:rFonts w:ascii="Arial" w:hAnsi="Arial" w:eastAsia="Yu Mincho" w:cs="Arial"/>
+                <w:b w:val="0"/>
+                <w:color w:val="17324D"/>
+                <w:sz w:val="17"/>
+              </w:rPr>
+              <w:t>Canonical track height is charged once; content and border remain inside this row.</w:t>
+            </w:r>
+          </w:p>
+        </w:tc>
+      </w:tr>
+      <w:tr>
+        <w:trPr>
+          <w:trHeight w:val="700" w:hRule="atLeast"/>
+          <w:cantSplit/>
+        </w:trPr>
+        <w:tc>
+          <w:tcPr>
+            <w:tcW w:type="dxa" w:w="3120"/>
+            <w:vMerge/>
+          </w:tcPr>
+          <w:p>
+            <w:r/>
+          </w:p>
+        </w:tc>
+        <w:tc>
+          <w:tcPr>
+            <w:tcW w:type="dxa" w:w="1080"/>
+            <w:vAlign w:val="center"/>
+            <w:shd w:val="clear" w:fill="F2F4F7"/>
+          </w:tcPr>
+          <w:p>
+            <w:pPr>
+              <w:spacing w:after="0"/>
+            </w:pPr>
+            <w:r>
+              <w:rPr>
+                <w:rFonts w:ascii="Arial" w:hAnsi="Arial" w:eastAsia="Yu Mincho" w:cs="Arial"/>
+                <w:b w:val="0"/>
+                <w:color w:val="17324D"/>
+                <w:sz w:val="17"/>
+              </w:rPr>
+              <w:t>T-04</w:t>
+            </w:r>
+          </w:p>
+        </w:tc>
+        <w:tc>
+          <w:tcPr>
+            <w:tcW w:type="dxa" w:w="6480"/>
+            <w:vAlign w:val="center"/>
+            <w:shd w:val="clear" w:fill="F2F4F7"/>
+            <w:tcBorders>
+              <w:right w:val="single" w:sz="10" w:space="0" w:color="2A7F8E"/>
+            </w:tcBorders>
+          </w:tcPr>
+          <w:p>
+            <w:pPr>
+              <w:spacing w:after="0"/>
+            </w:pPr>
+            <w:r>
+              <w:rPr>
+                <w:rFonts w:ascii="Arial" w:hAnsi="Arial" w:eastAsia="Yu Mincho" w:cs="Arial"/>
+                <w:b w:val="0"/>
+                <w:color w:val="17324D"/>
+                <w:sz w:val="17"/>
+              </w:rPr>
+              <w:t>Canonical track height is charged once; content and border remain inside this row.</w:t>
+            </w:r>
+          </w:p>
+        </w:tc>
+      </w:tr>
+      <w:tr>
+        <w:trPr>
+          <w:trHeight w:val="700" w:hRule="atLeast"/>
+          <w:cantSplit/>
+        </w:trPr>
+        <w:tc>
+          <w:tcPr>
+            <w:tcW w:type="dxa" w:w="3120"/>
+            <w:vMerge/>
+          </w:tcPr>
+          <w:p>
+            <w:r/>
+          </w:p>
+        </w:tc>
+        <w:tc>
+          <w:tcPr>
+            <w:tcW w:type="dxa" w:w="1080"/>
+            <w:vAlign w:val="center"/>
+          </w:tcPr>
+          <w:p>
+            <w:pPr>
+              <w:spacing w:after="0"/>
+            </w:pPr>
+            <w:r>
+              <w:rPr>
+                <w:rFonts w:ascii="Arial" w:hAnsi="Arial" w:eastAsia="Yu Mincho" w:cs="Arial"/>
+                <w:b w:val="0"/>
+                <w:color w:val="17324D"/>
+                <w:sz w:val="17"/>
+              </w:rPr>
+              <w:t>T-05</w:t>
+            </w:r>
+          </w:p>
+        </w:tc>
+        <w:tc>
+          <w:tcPr>
+            <w:tcW w:type="dxa" w:w="6480"/>
+            <w:vAlign w:val="center"/>
+            <w:tcBorders>
+              <w:right w:val="single" w:sz="10" w:space="0" w:color="2A7F8E"/>
+            </w:tcBorders>
+          </w:tcPr>
+          <w:p>
+            <w:pPr>
+              <w:spacing w:after="0"/>
+            </w:pPr>
+            <w:r>
+              <w:rPr>
+                <w:rFonts w:ascii="Arial" w:hAnsi="Arial" w:eastAsia="Yu Mincho" w:cs="Arial"/>
+                <w:b w:val="0"/>
+                <w:color w:val="17324D"/>
+                <w:sz w:val="17"/>
+              </w:rPr>
+              <w:t>Canonical track height is charged once; content and border remain inside this row.</w:t>
+            </w:r>
+          </w:p>
+        </w:tc>
+      </w:tr>
+      <w:tr>
+        <w:trPr>
+          <w:trHeight w:val="700" w:hRule="atLeast"/>
+          <w:cantSplit/>
+        </w:trPr>
+        <w:tc>
+          <w:tcPr>
+            <w:tcW w:type="dxa" w:w="3120"/>
+            <w:vMerge/>
+          </w:tcPr>
+          <w:p>
+            <w:r/>
+          </w:p>
+        </w:tc>
+        <w:tc>
+          <w:tcPr>
+            <w:tcW w:type="dxa" w:w="1080"/>
+            <w:vAlign w:val="center"/>
+            <w:shd w:val="clear" w:fill="F2F4F7"/>
+          </w:tcPr>
+          <w:p>
+            <w:pPr>
+              <w:spacing w:after="0"/>
+            </w:pPr>
+            <w:r>
+              <w:rPr>
+                <w:rFonts w:ascii="Arial" w:hAnsi="Arial" w:eastAsia="Yu Mincho" w:cs="Arial"/>
+                <w:b w:val="0"/>
+                <w:color w:val="17324D"/>
+                <w:sz w:val="17"/>
+              </w:rPr>
+              <w:t>T-06</w:t>
+            </w:r>
+          </w:p>
+        </w:tc>
+        <w:tc>
+          <w:tcPr>
+            <w:tcW w:type="dxa" w:w="6480"/>
+            <w:vAlign w:val="center"/>
+            <w:shd w:val="clear" w:fill="F2F4F7"/>
+            <w:tcBorders>
+              <w:right w:val="single" w:sz="10" w:space="0" w:color="2A7F8E"/>
+            </w:tcBorders>
+          </w:tcPr>
+          <w:p>
+            <w:pPr>
+              <w:spacing w:after="0"/>
+            </w:pPr>
+            <w:r>
+              <w:rPr>
+                <w:rFonts w:ascii="Arial" w:hAnsi="Arial" w:eastAsia="Yu Mincho" w:cs="Arial"/>
+                <w:b w:val="0"/>
+                <w:color w:val="17324D"/>
+                <w:sz w:val="17"/>
+              </w:rPr>
+              <w:t>Canonical track height is charged once; content and border remain inside this row.</w:t>
+            </w:r>
+          </w:p>
+        </w:tc>
+      </w:tr>
+      <w:tr>
+        <w:trPr>
+          <w:trHeight w:val="700" w:hRule="atLeast"/>
+          <w:cantSplit/>
+        </w:trPr>
+        <w:tc>
+          <w:tcPr>
+            <w:tcW w:type="dxa" w:w="3120"/>
+            <w:vMerge/>
+          </w:tcPr>
+          <w:p>
+            <w:r/>
+          </w:p>
+        </w:tc>
+        <w:tc>
+          <w:tcPr>
+            <w:tcW w:type="dxa" w:w="1080"/>
+            <w:vAlign w:val="center"/>
+          </w:tcPr>
+          <w:p>
+            <w:pPr>
+              <w:spacing w:after="0"/>
+            </w:pPr>
+            <w:r>
+              <w:rPr>
+                <w:rFonts w:ascii="Arial" w:hAnsi="Arial" w:eastAsia="Yu Mincho" w:cs="Arial"/>
+                <w:b w:val="0"/>
+                <w:color w:val="17324D"/>
+                <w:sz w:val="17"/>
+              </w:rPr>
+              <w:t>T-07</w:t>
+            </w:r>
+          </w:p>
+        </w:tc>
+        <w:tc>
+          <w:tcPr>
+            <w:tcW w:type="dxa" w:w="6480"/>
+            <w:vAlign w:val="center"/>
+            <w:tcBorders>
+              <w:right w:val="single" w:sz="10" w:space="0" w:color="2A7F8E"/>
+            </w:tcBorders>
+          </w:tcPr>
+          <w:p>
+            <w:pPr>
+              <w:spacing w:after="0"/>
+            </w:pPr>
+            <w:r>
+              <w:rPr>
+                <w:rFonts w:ascii="Arial" w:hAnsi="Arial" w:eastAsia="Yu Mincho" w:cs="Arial"/>
+                <w:b w:val="0"/>
+                <w:color w:val="17324D"/>
+                <w:sz w:val="17"/>
+              </w:rPr>
+              <w:t>Canonical track height is charged once; content and border remain inside this row.</w:t>
+            </w:r>
+          </w:p>
+        </w:tc>
+      </w:tr>
+      <w:tr>
+        <w:trPr>
+          <w:trHeight w:val="700" w:hRule="atLeast"/>
+          <w:cantSplit/>
+        </w:trPr>
+        <w:tc>
+          <w:tcPr>
+            <w:tcW w:type="dxa" w:w="3120"/>
+            <w:vMerge/>
+          </w:tcPr>
+          <w:p>
+            <w:r/>
+          </w:p>
+        </w:tc>
+        <w:tc>
+          <w:tcPr>
+            <w:tcW w:type="dxa" w:w="1080"/>
+            <w:vAlign w:val="center"/>
+            <w:shd w:val="clear" w:fill="F2F4F7"/>
+          </w:tcPr>
+          <w:p>
+            <w:pPr>
+              <w:spacing w:after="0"/>
+            </w:pPr>
+            <w:r>
+              <w:rPr>
+                <w:rFonts w:ascii="Arial" w:hAnsi="Arial" w:eastAsia="Yu Mincho" w:cs="Arial"/>
+                <w:b w:val="0"/>
+                <w:color w:val="17324D"/>
+                <w:sz w:val="17"/>
+              </w:rPr>
+              <w:t>T-08</w:t>
+            </w:r>
+          </w:p>
+        </w:tc>
+        <w:tc>
+          <w:tcPr>
+            <w:tcW w:type="dxa" w:w="6480"/>
+            <w:vAlign w:val="center"/>
+            <w:shd w:val="clear" w:fill="F2F4F7"/>
+            <w:tcBorders>
+              <w:right w:val="single" w:sz="10" w:space="0" w:color="2A7F8E"/>
+            </w:tcBorders>
+          </w:tcPr>
+          <w:p>
+            <w:pPr>
+              <w:spacing w:after="0"/>
+            </w:pPr>
+            <w:r>
+              <w:rPr>
+                <w:rFonts w:ascii="Arial" w:hAnsi="Arial" w:eastAsia="Yu Mincho" w:cs="Arial"/>
+                <w:b w:val="0"/>
+                <w:color w:val="17324D"/>
+                <w:sz w:val="17"/>
+              </w:rPr>
+              <w:t>Canonical track height is charged once; content and border remain inside this row.</w:t>
+            </w:r>
+          </w:p>
+        </w:tc>
+      </w:tr>
+      <w:tr>
+        <w:trPr>
+          <w:trHeight w:val="700" w:hRule="atLeast"/>
+          <w:cantSplit/>
+        </w:trPr>
+        <w:tc>
+          <w:tcPr>
+            <w:tcW w:type="dxa" w:w="3120"/>
+            <w:vMerge/>
+          </w:tcPr>
+          <w:p>
+            <w:r/>
+          </w:p>
+        </w:tc>
+        <w:tc>
+          <w:tcPr>
+            <w:tcW w:type="dxa" w:w="1080"/>
+            <w:vAlign w:val="center"/>
+          </w:tcPr>
+          <w:p>
+            <w:pPr>
+              <w:spacing w:after="0"/>
+            </w:pPr>
+            <w:r>
+              <w:rPr>
+                <w:rFonts w:ascii="Arial" w:hAnsi="Arial" w:eastAsia="Yu Mincho" w:cs="Arial"/>
+                <w:b w:val="0"/>
+                <w:color w:val="17324D"/>
+                <w:sz w:val="17"/>
+              </w:rPr>
+              <w:t>T-09</w:t>
+            </w:r>
+          </w:p>
+        </w:tc>
+        <w:tc>
+          <w:tcPr>
+            <w:tcW w:type="dxa" w:w="6480"/>
+            <w:vAlign w:val="center"/>
+            <w:tcBorders>
+              <w:right w:val="single" w:sz="10" w:space="0" w:color="2A7F8E"/>
+            </w:tcBorders>
+          </w:tcPr>
+          <w:p>
+            <w:pPr>
+              <w:spacing w:after="0"/>
+            </w:pPr>
+            <w:r>
+              <w:rPr>
+                <w:rFonts w:ascii="Arial" w:hAnsi="Arial" w:eastAsia="Yu Mincho" w:cs="Arial"/>
+                <w:b w:val="0"/>
+                <w:color w:val="17324D"/>
+                <w:sz w:val="17"/>
+              </w:rPr>
+              <w:t>Canonical track height is charged once; content and border remain inside this row.</w:t>
+            </w:r>
+          </w:p>
+        </w:tc>
+      </w:tr>
+      <w:tr>
+        <w:trPr>
+          <w:trHeight w:val="700" w:hRule="atLeast"/>
+          <w:cantSplit/>
+        </w:trPr>
+        <w:tc>
+          <w:tcPr>
+            <w:tcW w:type="dxa" w:w="3120"/>
+            <w:vMerge/>
+          </w:tcPr>
+          <w:p>
+            <w:r/>
+          </w:p>
+        </w:tc>
+        <w:tc>
+          <w:tcPr>
+            <w:tcW w:type="dxa" w:w="1080"/>
+            <w:vAlign w:val="center"/>
+            <w:shd w:val="clear" w:fill="F2F4F7"/>
+          </w:tcPr>
+          <w:p>
+            <w:pPr>
+              <w:spacing w:after="0"/>
+            </w:pPr>
+            <w:r>
+              <w:rPr>
+                <w:rFonts w:ascii="Arial" w:hAnsi="Arial" w:eastAsia="Yu Mincho" w:cs="Arial"/>
+                <w:b w:val="0"/>
+                <w:color w:val="17324D"/>
+                <w:sz w:val="17"/>
+              </w:rPr>
+              <w:t>T-10</w:t>
+            </w:r>
+          </w:p>
+        </w:tc>
+        <w:tc>
+          <w:tcPr>
+            <w:tcW w:type="dxa" w:w="6480"/>
+            <w:vAlign w:val="center"/>
+            <w:shd w:val="clear" w:fill="F2F4F7"/>
+            <w:tcBorders>
+              <w:right w:val="single" w:sz="10" w:space="0" w:color="2A7F8E"/>
+            </w:tcBorders>
+          </w:tcPr>
+          <w:p>
+            <w:pPr>
+              <w:spacing w:after="0"/>
+            </w:pPr>
+            <w:r>
+              <w:rPr>
+                <w:rFonts w:ascii="Arial" w:hAnsi="Arial" w:eastAsia="Yu Mincho" w:cs="Arial"/>
+                <w:b w:val="0"/>
+                <w:color w:val="17324D"/>
+                <w:sz w:val="17"/>
+              </w:rPr>
+              <w:t>Canonical track height is charged once; content and border remain inside this row.</w:t>
+            </w:r>
+          </w:p>
+        </w:tc>
+      </w:tr>
+      <w:tr>
+        <w:trPr>
+          <w:trHeight w:val="700" w:hRule="atLeast"/>
+          <w:cantSplit/>
+        </w:trPr>
+        <w:tc>
+          <w:tcPr>
+            <w:tcW w:type="dxa" w:w="3120"/>
+            <w:vMerge/>
+          </w:tcPr>
+          <w:p>
+            <w:r/>
+          </w:p>
+        </w:tc>
+        <w:tc>
+          <w:tcPr>
+            <w:tcW w:type="dxa" w:w="1080"/>
+            <w:vAlign w:val="center"/>
+          </w:tcPr>
+          <w:p>
+            <w:pPr>
+              <w:spacing w:after="0"/>
+            </w:pPr>
+            <w:r>
+              <w:rPr>
+                <w:rFonts w:ascii="Arial" w:hAnsi="Arial" w:eastAsia="Yu Mincho" w:cs="Arial"/>
+                <w:b w:val="0"/>
+                <w:color w:val="17324D"/>
+                <w:sz w:val="17"/>
+              </w:rPr>
+              <w:t>T-11</w:t>
+            </w:r>
+          </w:p>
+        </w:tc>
+        <w:tc>
+          <w:tcPr>
+            <w:tcW w:type="dxa" w:w="6480"/>
+            <w:vAlign w:val="center"/>
+            <w:tcBorders>
+              <w:right w:val="single" w:sz="10" w:space="0" w:color="2A7F8E"/>
+            </w:tcBorders>
+          </w:tcPr>
+          <w:p>
+            <w:pPr>
+              <w:spacing w:after="0"/>
+            </w:pPr>
+            <w:r>
+              <w:rPr>
+                <w:rFonts w:ascii="Arial" w:hAnsi="Arial" w:eastAsia="Yu Mincho" w:cs="Arial"/>
+                <w:b w:val="0"/>
+                <w:color w:val="17324D"/>
+                <w:sz w:val="17"/>
+              </w:rPr>
+              <w:t>Canonical track height is charged once; content and border remain inside this row.</w:t>
+            </w:r>
+          </w:p>
+        </w:tc>
+      </w:tr>
+      <w:tr>
+        <w:trPr>
+          <w:trHeight w:val="700" w:hRule="atLeast"/>
+          <w:cantSplit/>
+        </w:trPr>
+        <w:tc>
+          <w:tcPr>
+            <w:tcW w:type="dxa" w:w="3120"/>
+            <w:vMerge/>
+          </w:tcPr>
+          <w:p>
+            <w:r/>
+          </w:p>
+        </w:tc>
+        <w:tc>
+          <w:tcPr>
+            <w:tcW w:type="dxa" w:w="1080"/>
+            <w:vAlign w:val="center"/>
+            <w:shd w:val="clear" w:fill="F2F4F7"/>
+          </w:tcPr>
+          <w:p>
+            <w:pPr>
+              <w:spacing w:after="0"/>
+            </w:pPr>
+            <w:r>
+              <w:rPr>
+                <w:rFonts w:ascii="Arial" w:hAnsi="Arial" w:eastAsia="Yu Mincho" w:cs="Arial"/>
+                <w:b w:val="0"/>
+                <w:color w:val="17324D"/>
+                <w:sz w:val="17"/>
+              </w:rPr>
+              <w:t>T-12</w:t>
+            </w:r>
+          </w:p>
+        </w:tc>
+        <w:tc>
+          <w:tcPr>
+            <w:tcW w:type="dxa" w:w="6480"/>
+            <w:vAlign w:val="center"/>
+            <w:shd w:val="clear" w:fill="F2F4F7"/>
+            <w:tcBorders>
+              <w:right w:val="single" w:sz="10" w:space="0" w:color="2A7F8E"/>
+            </w:tcBorders>
+          </w:tcPr>
+          <w:p>
+            <w:pPr>
+              <w:spacing w:after="0"/>
+            </w:pPr>
+            <w:r>
+              <w:rPr>
+                <w:rFonts w:ascii="Arial" w:hAnsi="Arial" w:eastAsia="Yu Mincho" w:cs="Arial"/>
+                <w:b w:val="0"/>
+                <w:color w:val="17324D"/>
+                <w:sz w:val="17"/>
+              </w:rPr>
+              <w:t>Canonical track height is charged once; content and border remain inside this row.</w:t>
+            </w:r>
+          </w:p>
+        </w:tc>
+      </w:tr>
+      <w:tr>
+        <w:trPr>
+          <w:trHeight w:val="700" w:hRule="atLeast"/>
+          <w:cantSplit/>
+        </w:trPr>
+        <w:tc>
+          <w:tcPr>
+            <w:tcW w:type="dxa" w:w="3120"/>
+            <w:vMerge/>
+          </w:tcPr>
+          <w:p>
+            <w:r/>
+          </w:p>
+        </w:tc>
+        <w:tc>
+          <w:tcPr>
+            <w:tcW w:type="dxa" w:w="1080"/>
+            <w:vAlign w:val="center"/>
+          </w:tcPr>
+          <w:p>
+            <w:pPr>
+              <w:spacing w:after="0"/>
+            </w:pPr>
+            <w:r>
+              <w:rPr>
+                <w:rFonts w:ascii="Arial" w:hAnsi="Arial" w:eastAsia="Yu Mincho" w:cs="Arial"/>
+                <w:b w:val="0"/>
+                <w:color w:val="17324D"/>
+                <w:sz w:val="17"/>
+              </w:rPr>
+              <w:t>T-13</w:t>
+            </w:r>
+          </w:p>
+        </w:tc>
+        <w:tc>
+          <w:tcPr>
+            <w:tcW w:type="dxa" w:w="6480"/>
+            <w:vAlign w:val="center"/>
+            <w:tcBorders>
+              <w:right w:val="single" w:sz="10" w:space="0" w:color="2A7F8E"/>
+            </w:tcBorders>
+          </w:tcPr>
+          <w:p>
+            <w:pPr>
+              <w:spacing w:after="0"/>
+            </w:pPr>
+            <w:r>
+              <w:rPr>
+                <w:rFonts w:ascii="Arial" w:hAnsi="Arial" w:eastAsia="Yu Mincho" w:cs="Arial"/>
+                <w:b w:val="0"/>
+                <w:color w:val="17324D"/>
+                <w:sz w:val="17"/>
+              </w:rPr>
+              <w:t>Canonical track height is charged once; content and border remain inside this row.</w:t>
+            </w:r>
+          </w:p>
+        </w:tc>
+      </w:tr>
+      <w:tr>
+        <w:trPr>
+          <w:trHeight w:val="700" w:hRule="atLeast"/>
+          <w:cantSplit/>
+        </w:trPr>
+        <w:tc>
+          <w:tcPr>
+            <w:tcW w:type="dxa" w:w="3120"/>
+            <w:vMerge/>
+          </w:tcPr>
+          <w:p>
+            <w:r/>
+          </w:p>
+        </w:tc>
+        <w:tc>
+          <w:tcPr>
+            <w:tcW w:type="dxa" w:w="1080"/>
+            <w:vAlign w:val="center"/>
+            <w:shd w:val="clear" w:fill="F2F4F7"/>
+          </w:tcPr>
+          <w:p>
+            <w:pPr>
+              <w:spacing w:after="0"/>
+            </w:pPr>
+            <w:r>
+              <w:rPr>
+                <w:rFonts w:ascii="Arial" w:hAnsi="Arial" w:eastAsia="Yu Mincho" w:cs="Arial"/>
+                <w:b w:val="0"/>
+                <w:color w:val="17324D"/>
+                <w:sz w:val="17"/>
+              </w:rPr>
+              <w:t>T-14</w:t>
+            </w:r>
+          </w:p>
+        </w:tc>
+        <w:tc>
+          <w:tcPr>
+            <w:tcW w:type="dxa" w:w="6480"/>
+            <w:vAlign w:val="center"/>
+            <w:shd w:val="clear" w:fill="F2F4F7"/>
+            <w:tcBorders>
+              <w:right w:val="single" w:sz="10" w:space="0" w:color="2A7F8E"/>
+            </w:tcBorders>
+          </w:tcPr>
+          <w:p>
+            <w:pPr>
+              <w:spacing w:after="0"/>
+            </w:pPr>
+            <w:r>
+              <w:rPr>
+                <w:rFonts w:ascii="Arial" w:hAnsi="Arial" w:eastAsia="Yu Mincho" w:cs="Arial"/>
+                <w:b w:val="0"/>
+                <w:color w:val="17324D"/>
+                <w:sz w:val="17"/>
+              </w:rPr>
+              <w:t>Canonical track height is charged once; content and border remain inside this row.</w:t>
+            </w:r>
+          </w:p>
+        </w:tc>
+      </w:tr>
+      <w:tr>
+        <w:trPr>
+          <w:trHeight w:val="700" w:hRule="atLeast"/>
+          <w:cantSplit/>
+        </w:trPr>
+        <w:tc>
+          <w:tcPr>
+            <w:tcW w:type="dxa" w:w="3120"/>
+            <w:vMerge/>
+          </w:tcPr>
+          <w:p>
+            <w:r/>
+          </w:p>
+        </w:tc>
+        <w:tc>
+          <w:tcPr>
+            <w:tcW w:type="dxa" w:w="1080"/>
+            <w:vAlign w:val="center"/>
+          </w:tcPr>
+          <w:p>
+            <w:pPr>
+              <w:spacing w:after="0"/>
+            </w:pPr>
+            <w:r>
+              <w:rPr>
+                <w:rFonts w:ascii="Arial" w:hAnsi="Arial" w:eastAsia="Yu Mincho" w:cs="Arial"/>
+                <w:b w:val="0"/>
+                <w:color w:val="17324D"/>
+                <w:sz w:val="17"/>
+              </w:rPr>
+              <w:t>T-15</w:t>
+            </w:r>
+          </w:p>
+        </w:tc>
+        <w:tc>
+          <w:tcPr>
+            <w:tcW w:type="dxa" w:w="6480"/>
+            <w:vAlign w:val="center"/>
+            <w:tcBorders>
+              <w:right w:val="single" w:sz="10" w:space="0" w:color="2A7F8E"/>
+            </w:tcBorders>
+          </w:tcPr>
+          <w:p>
+            <w:pPr>
+              <w:spacing w:after="0"/>
+            </w:pPr>
+            <w:r>
+              <w:rPr>
+                <w:rFonts w:ascii="Arial" w:hAnsi="Arial" w:eastAsia="Yu Mincho" w:cs="Arial"/>
+                <w:b w:val="0"/>
+                <w:color w:val="17324D"/>
+                <w:sz w:val="17"/>
+              </w:rPr>
+              <w:t>Canonical track height is charged once; content and border remain inside this row.</w:t>
+            </w:r>
+          </w:p>
+        </w:tc>
+      </w:tr>
+      <w:tr>
+        <w:trPr>
+          <w:trHeight w:val="700" w:hRule="atLeast"/>
+          <w:cantSplit/>
+        </w:trPr>
+        <w:tc>
+          <w:tcPr>
+            <w:tcW w:type="dxa" w:w="3120"/>
+            <w:vMerge/>
+          </w:tcPr>
+          <w:p>
+            <w:r/>
+          </w:p>
+        </w:tc>
+        <w:tc>
+          <w:tcPr>
+            <w:tcW w:type="dxa" w:w="1080"/>
+            <w:vAlign w:val="center"/>
+            <w:shd w:val="clear" w:fill="F2F4F7"/>
+          </w:tcPr>
+          <w:p>
+            <w:pPr>
+              <w:spacing w:after="0"/>
+            </w:pPr>
+            <w:r>
+              <w:rPr>
+                <w:rFonts w:ascii="Arial" w:hAnsi="Arial" w:eastAsia="Yu Mincho" w:cs="Arial"/>
+                <w:b w:val="0"/>
+                <w:color w:val="17324D"/>
+                <w:sz w:val="17"/>
+              </w:rPr>
+              <w:t>T-16</w:t>
+            </w:r>
+          </w:p>
+        </w:tc>
+        <w:tc>
+          <w:tcPr>
+            <w:tcW w:type="dxa" w:w="6480"/>
+            <w:vAlign w:val="center"/>
+            <w:shd w:val="clear" w:fill="F2F4F7"/>
+            <w:tcBorders>
+              <w:right w:val="single" w:sz="10" w:space="0" w:color="2A7F8E"/>
+            </w:tcBorders>
+          </w:tcPr>
+          <w:p>
+            <w:pPr>
+              <w:spacing w:after="0"/>
+            </w:pPr>
+            <w:r>
+              <w:rPr>
+                <w:rFonts w:ascii="Arial" w:hAnsi="Arial" w:eastAsia="Yu Mincho" w:cs="Arial"/>
+                <w:b w:val="0"/>
+                <w:color w:val="17324D"/>
+                <w:sz w:val="17"/>
+              </w:rPr>
+              <w:t>Canonical track height is charged once; content and border remain inside this row.</w:t>
+            </w:r>
+          </w:p>
+        </w:tc>
+      </w:tr>
+    </w:tbl>
+    <w:p>
+      <w:pPr>
+        <w:spacing w:before="80" w:after="80"/>
+      </w:pPr>
+      <w:r>
+        <w:rPr>
+          <w:rFonts w:ascii="Arial" w:hAnsi="Arial" w:eastAsia="Yu Mincho" w:cs="Arial"/>
+          <w:b w:val="0"/>
+          <w:color w:val="5B6573"/>
+          <w:sz w:val="17"/>
+        </w:rPr>
+        <w:t>Table continuation terminus: all sixteen physical tracks completed.</w:t>
+      </w:r>
+    </w:p>
+    <w:p>
+      <w:r>
+        <w:br w:type="page"/>
+      </w:r>
+    </w:p>
+    <w:p>
+      <w:pPr>
+        <w:pStyle w:val="Heading1"/>
+      </w:pPr>
+      <w:r>
+        <w:t>Drawing-group transform regression</w:t>
+      </w:r>
+    </w:p>
+    <w:p>
+      <w:pPr>
+        <w:keepNext/>
+        <w:spacing w:before="160" w:after="100" w:line="276" w:lineRule="auto"/>
+      </w:pPr>
+      <w:r>
+        <w:rPr>
+          <w:rFonts w:ascii="Arial" w:hAnsi="Arial" w:eastAsia="Yu Mincho" w:cs="Arial"/>
+          <w:b/>
+          <w:color w:val="FFFFFF"/>
+          <w:sz w:val="17"/>
+          <w:shd w:val="clear" w:fill="2A7F8E"/>
+        </w:rPr>
+        <w:t>D-GROUP-001</w:t>
+      </w:r>
+      <w:r>
+        <w:rPr>
+          <w:rFonts w:ascii="Arial" w:hAnsi="Arial" w:eastAsia="Yu Mincho" w:cs="Arial"/>
+          <w:b w:val="0"/>
+          <w:color w:val="17324D"/>
+          <w:sz w:val="17"/>
+        </w:rPr>
+        <w:t xml:space="preserve">   </w:t>
+      </w:r>
+      <w:r>
+        <w:rPr>
+          <w:rFonts w:ascii="Arial" w:hAnsi="Arial" w:eastAsia="Yu Mincho" w:cs="Arial"/>
+          <w:b/>
+          <w:color w:val="17324D"/>
+          <w:sz w:val="21"/>
+        </w:rPr>
+        <w:t>Exact quarter-turn scaling is invariant to a neutral group wrapper</w:t>
+      </w:r>
+    </w:p>
+    <w:p>
+      <w:pPr>
+        <w:spacing w:after="100" w:line="276" w:lineRule="auto"/>
+      </w:pPr>
+      <w:r>
+        <w:rPr>
+          <w:rFonts w:ascii="Arial" w:hAnsi="Arial" w:eastAsia="Yu Mincho" w:cs="Arial"/>
+          <w:b w:val="0"/>
+          <w:color w:val="5B6573"/>
+          <w:sz w:val="17"/>
+        </w:rPr>
+        <w:t>The teal direct leaf and amber identity-wrapped leaf use equal authored boxes and 90° rotation under one non-uniform outer group. They must retain equal rendered dimensions.</w:t>
+      </w:r>
+    </w:p>
+    <w:p>
+      <w:pPr>
+        <w:spacing w:after="2160"/>
+      </w:pPr>
+      <w:r xmlns:a="http://schemas.openxmlformats.org/drawingml/2006/main">
+        <w:drawing>
+          <wp:anchor distT="0" distB="0" distL="0" distR="0" simplePos="0" relativeHeight="251658240" behindDoc="0" locked="0" layoutInCell="1" allowOverlap="1">
+            <wp:simplePos x="0" y="0"/>
+            <wp:positionH relativeFrom="column">
+              <wp:posOffset>0</wp:posOffset>
+            </wp:positionH>
+            <wp:positionV relativeFrom="paragraph">
+              <wp:posOffset>190500</wp:posOffset>
+            </wp:positionV>
+            <wp:extent cx="4000000" cy="1371600"/>
+            <wp:effectExtent l="0" t="0" r="0" b="0"/>
+            <wp:wrapNone/>
+            <wp:docPr id="9201" name="D-GROUP-001 exact quarter-turn group"/>
+            <wp:cNvGraphicFramePr/>
+            <a:graphic>
+              <a:graphicData uri="http://schemas.microsoft.com/office/word/2010/wordprocessingGroup">
+                <wpg:wgp>
+                  <wpg:cNvGrpSpPr/>
+                  <wpg:grpSpPr>
+                    <a:xfrm>
+                      <a:off x="0" y="0"/>
+                      <a:ext cx="4000000" cy="1371600"/>
+                      <a:chOff x="0" y="0"/>
+                      <a:chExt cx="2971800" cy="1371600"/>
+                    </a:xfrm>
+                  </wpg:grpSpPr>
+                  <wps:wsp>
+                    <wps:cNvSpPr/>
+                    <wps:spPr>
+                      <a:xfrm rot="5400000">
+                        <a:off x="254000" y="254000"/>
+                        <a:ext cx="508000" cy="127000"/>
+                      </a:xfrm>
+                      <a:prstGeom prst="rect">
+                        <a:avLst/>
+                      </a:prstGeom>
+                      <a:solidFill>
+                        <a:srgbClr val="2A7F8E"/>
+                      </a:solidFill>
+                      <a:ln w="25400">
+                        <a:solidFill>
+                          <a:srgbClr val="17324D"/>
+                        </a:solidFill>
+                      </a:ln>
+                    </wps:spPr>
+                    <wps:bodyPr/>
+                  </wps:wsp>
+                  <wpg:grpSp>
+                    <wpg:cNvGrpSpPr/>
+                    <wpg:grpSpPr>
+                      <a:xfrm>
+                        <a:off x="500000" y="0"/>
+                        <a:ext cx="1270000" cy="1270000"/>
+                        <a:chOff x="0" y="0"/>
+                        <a:chExt cx="1270000" cy="1270000"/>
+                      </a:xfrm>
+                    </wpg:grpSpPr>
+                    <wps:wsp>
+                      <wps:cNvSpPr/>
+                      <wps:spPr>
+                        <a:xfrm rot="5400000">
+                          <a:off x="254000" y="254000"/>
+                          <a:ext cx="508000" cy="127000"/>
+                        </a:xfrm>
+                        <a:prstGeom prst="rect">
+                          <a:avLst/>
+                        </a:prstGeom>
+                        <a:solidFill>
+                          <a:srgbClr val="E3A008"/>
+                        </a:solidFill>
+                        <a:ln w="25400">
+                          <a:solidFill>
+                            <a:srgbClr val="17324D"/>
+                          </a:solidFill>
+                        </a:ln>
+                      </wps:spPr>
+                      <wps:bodyPr/>
+                    </wps:wsp>
+                  </wpg:grpSp>
+                </wpg:wgp>
+              </a:graphicData>
+            </a:graphic>
+          </wp:anchor>
+        </w:drawing>
+      </w:r>
+    </w:p>
+    <w:p>
+      <w:pPr>
+        <w:keepNext/>
+        <w:spacing w:before="160" w:after="100" w:line="276" w:lineRule="auto"/>
+      </w:pPr>
+      <w:r>
+        <w:rPr>
+          <w:rFonts w:ascii="Arial" w:hAnsi="Arial" w:eastAsia="Yu Mincho" w:cs="Arial"/>
+          <w:b/>
+          <w:color w:val="FFFFFF"/>
+          <w:sz w:val="17"/>
+          <w:shd w:val="clear" w:fill="2A7F8E"/>
+        </w:rPr>
+        <w:t>D-PAGE-002</w:t>
+      </w:r>
+      <w:r>
+        <w:rPr>
+          <w:rFonts w:ascii="Arial" w:hAnsi="Arial" w:eastAsia="Yu Mincho" w:cs="Arial"/>
+          <w:b w:val="0"/>
+          <w:color w:val="17324D"/>
+          <w:sz w:val="17"/>
+        </w:rPr>
+        <w:t xml:space="preserve">   </w:t>
+      </w:r>
+      <w:r>
+        <w:rPr>
+          <w:rFonts w:ascii="Arial" w:hAnsi="Arial" w:eastAsia="Yu Mincho" w:cs="Arial"/>
+          <w:b/>
+          <w:color w:val="17324D"/>
+          <w:sz w:val="21"/>
+        </w:rPr>
+        <w:t>Following content stays on this page beneath the anchored gauge group</w:t>
+      </w:r>
+    </w:p>
+    <w:p>
+      <w:pPr>
+        <w:spacing w:after="100" w:line="276" w:lineRule="auto"/>
+      </w:pPr>
+      <w:r>
+        <w:rPr>
+          <w:rFonts w:ascii="Arial" w:hAnsi="Arial" w:eastAsia="Yu Mincho" w:cs="Arial"/>
+          <w:b w:val="0"/>
+          <w:color w:val="5B6573"/>
+          <w:sz w:val="17"/>
+        </w:rPr>
+        <w:t>This block must not be pushed to a phantom continuation page, overlap the group, or disappear when the drawing hierarchy is retained.</w:t>
+      </w:r>
+    </w:p>
+    <w:tbl>
+      <w:tblPr>
+        <w:tblStyle w:val="TableGrid"/>
+        <w:tblLook w:firstColumn="1" w:firstRow="1" w:lastColumn="0" w:lastRow="0" w:noHBand="0" w:noVBand="1" w:val="04A0"/>
+        <w:tblW w:type="dxa" w:w="9360"/>
+        <w:tblInd w:type="dxa" w:w="120"/>
+        <w:tblLayout w:type="fixed"/>
+        <w:tblCellMar>
+          <w:top w:type="dxa" w:w="80"/>
+          <w:start w:type="dxa" w:w="120"/>
+          <w:bottom w:type="dxa" w:w="80"/>
+          <w:end w:type="dxa" w:w="120"/>
+        </w:tblCellMar>
+      </w:tblPr>
+      <w:tblGrid>
+        <w:gridCol w:w="2800"/>
+        <w:gridCol w:w="6560"/>
+      </w:tblGrid>
+      <w:tr>
+        <w:tc>
+          <w:tcPr>
+            <w:tcW w:type="dxa" w:w="2800"/>
+            <w:vAlign w:val="center"/>
+          </w:tcPr>
+          <w:p>
+            <w:r>
+              <w:rPr>
+                <w:rFonts w:ascii="Arial" w:hAnsi="Arial" w:eastAsia="Yu Mincho" w:cs="Arial"/>
+                <w:b/>
+                <w:color w:val="17324D"/>
+                <w:sz w:val="19"/>
+              </w:rPr>
+              <w:t>Capability</w:t>
+            </w:r>
+          </w:p>
+        </w:tc>
+        <w:tc>
+          <w:tcPr>
+            <w:tcW w:type="dxa" w:w="6560"/>
+            <w:vAlign w:val="center"/>
+            <w:shd w:val="clear" w:fill="D9EAF0"/>
+          </w:tcPr>
+          <w:p>
+            <w:r>
+              <w:rPr>
+                <w:rFonts w:ascii="Arial" w:hAnsi="Arial" w:eastAsia="Yu Mincho" w:cs="Arial"/>
+                <w:b/>
+                <w:color w:val="17324D"/>
+                <w:sz w:val="19"/>
+              </w:rPr>
+              <w:t>Stable</w:t>
+            </w:r>
+          </w:p>
+        </w:tc>
+      </w:tr>
+      <w:tr>
+        <w:tc>
+          <w:tcPr>
+            <w:tcW w:type="dxa" w:w="2800"/>
+            <w:vAlign w:val="center"/>
+          </w:tcPr>
+          <w:p>
+            <w:r>
+              <w:rPr>
+                <w:rFonts w:ascii="Arial" w:hAnsi="Arial" w:eastAsia="Yu Mincho" w:cs="Arial"/>
+                <w:b w:val="0"/>
+                <w:color w:val="17324D"/>
+                <w:sz w:val="19"/>
+              </w:rPr>
+              <w:t>Measure</w:t>
+            </w:r>
+          </w:p>
+        </w:tc>
+        <w:tc>
+          <w:tcPr>
+            <w:tcW w:type="dxa" w:w="6560"/>
+            <w:vAlign w:val="center"/>
+            <w:shd w:val="clear" w:fill="E8EEF5"/>
+          </w:tcPr>
+          <w:p>
+            <w:r>
+              <w:rPr>
+                <w:rFonts w:ascii="Arial" w:hAnsi="Arial" w:eastAsia="Yu Mincho" w:cs="Arial"/>
+                <w:b w:val="0"/>
+                <w:color w:val="17324D"/>
+                <w:sz w:val="19"/>
+              </w:rPr>
+              <w:t>Retained</w:t>
+            </w:r>
+          </w:p>
+        </w:tc>
+      </w:tr>
+      <w:tr>
+        <w:tc>
+          <w:tcPr>
+            <w:tcW w:type="dxa" w:w="2800"/>
+            <w:vAlign w:val="center"/>
+          </w:tcPr>
+          <w:p>
+            <w:r>
+              <w:rPr>
+                <w:rFonts w:ascii="Arial" w:hAnsi="Arial" w:eastAsia="Yu Mincho" w:cs="Arial"/>
+                <w:b w:val="0"/>
+                <w:color w:val="17324D"/>
+                <w:sz w:val="19"/>
+              </w:rPr>
+              <w:t>Paint</w:t>
+            </w:r>
+          </w:p>
+        </w:tc>
+        <w:tc>
+          <w:tcPr>
+            <w:tcW w:type="dxa" w:w="6560"/>
+            <w:vAlign w:val="center"/>
+            <w:shd w:val="clear" w:fill="F2F4F7"/>
+          </w:tcPr>
+          <w:p>
+            <w:r>
+              <w:rPr>
+                <w:rFonts w:ascii="Arial" w:hAnsi="Arial" w:eastAsia="Yu Mincho" w:cs="Arial"/>
+                <w:b w:val="0"/>
+                <w:color w:val="17324D"/>
+                <w:sz w:val="19"/>
+              </w:rPr>
+              <w:t>Immutable</w:t>
+            </w:r>
+          </w:p>
+        </w:tc>
+      </w:tr>
+      <w:tr>
+        <w:tc>
+          <w:tcPr>
+            <w:tcW w:type="dxa" w:w="2800"/>
+            <w:vAlign w:val="center"/>
+          </w:tcPr>
+          <w:p>
+            <w:r>
+              <w:rPr>
+                <w:rFonts w:ascii="Arial" w:hAnsi="Arial" w:eastAsia="Yu Mincho" w:cs="Arial"/>
+                <w:b w:val="0"/>
+                <w:color w:val="17324D"/>
+                <w:sz w:val="19"/>
+              </w:rPr>
+              <w:t>Fallback</w:t>
+            </w:r>
+          </w:p>
+        </w:tc>
+        <w:tc>
+          <w:tcPr>
+            <w:tcW w:type="dxa" w:w="6560"/>
+            <w:vAlign w:val="center"/>
+            <w:shd w:val="clear" w:fill="FFF4D6"/>
+          </w:tcPr>
+          <w:p>
+            <w:r>
+              <w:rPr>
+                <w:rFonts w:ascii="Arial" w:hAnsi="Arial" w:eastAsia="Yu Mincho" w:cs="Arial"/>
+                <w:b w:val="0"/>
+                <w:color w:val="17324D"/>
+                <w:sz w:val="19"/>
+              </w:rPr>
+              <w:t>Visible</w:t>
+            </w:r>
+          </w:p>
+        </w:tc>
+      </w:tr>
+    </w:tbl>
     <w:sectPr>
       <w:pgSz w:w="12240" w:h="15840"/>
       <w:pgMar w:top="1152" w:right="1440" w:bottom="1152" w:left="1440" w:header="648" w:footer="648" w:gutter="0"/>
@@ -6437,6 +8602,66 @@
       </w:rPr>
     </w:lvl>
   </w:abstractNum>
+  <w:abstractNum w:abstractNumId="11">
+    <w:multiLevelType w:val="singleLevel"/>
+    <w:lvl w:ilvl="0">
+      <w:start w:val="1"/>
+      <w:numFmt w:val="decimal"/>
+      <w:lvlText w:val="%1)"/>
+      <w:lvlJc w:val="right"/>
+      <w:pPr>
+        <w:tabs>
+          <w:tab w:val="num" w:pos="720"/>
+        </w:tabs>
+        <w:ind w:left="720" w:hanging="360"/>
+        <w:spacing w:after="80" w:line="300" w:lineRule="auto"/>
+      </w:pPr>
+      <w:rPr>
+        <w:rFonts w:ascii="Arial" w:hAnsi="Arial" w:eastAsia="Yu Mincho"/>
+        <w:sz w:val="22"/>
+      </w:rPr>
+    </w:lvl>
+  </w:abstractNum>
+  <w:abstractNum w:abstractNumId="12">
+    <w:multiLevelType w:val="singleLevel"/>
+    <w:lvl w:ilvl="0">
+      <w:start w:val="1"/>
+      <w:numFmt w:val="none"/>
+      <w:lvlText w:val=""/>
+      <w:lvlJc w:val="right"/>
+      <w:pPr>
+        <w:tabs>
+          <w:tab w:val="num" w:pos="720"/>
+        </w:tabs>
+        <w:ind w:left="720" w:hanging="360"/>
+        <w:spacing w:after="80" w:line="300" w:lineRule="auto"/>
+      </w:pPr>
+      <w:rPr>
+        <w:rFonts w:ascii="Arial" w:hAnsi="Arial" w:eastAsia="Yu Mincho"/>
+        <w:sz w:val="22"/>
+      </w:rPr>
+    </w:lvl>
+  </w:abstractNum>
+  <w:abstractNum w:abstractNumId="13">
+    <w:multiLevelType w:val="singleLevel"/>
+    <w:lvl w:ilvl="0">
+      <w:start w:val="1"/>
+      <w:numFmt w:val="lowerRoman"/>
+      <w:lvlText w:val="%1."/>
+      <w:lvlJc w:val="right"/>
+      <w:pPr>
+        <w:tabs>
+          <w:tab w:val="num" w:pos="720"/>
+        </w:tabs>
+        <w:ind w:left="720" w:hanging="360"/>
+        <w:spacing w:after="80" w:line="300" w:lineRule="auto"/>
+      </w:pPr>
+      <w:rPr>
+        <w:rFonts w:ascii="Arial" w:hAnsi="Arial" w:eastAsia="Yu Mincho"/>
+        <w:sz w:val="22"/>
+      </w:rPr>
+    </w:lvl>
+  </w:abstractNum>
   <w:num w:numId="1">
     <w:abstractNumId w:val="8"/>
   </w:num>
@@ -6577,6 +8802,15 @@
   </w:abstractNum>
   <w:num w:numId="11">
     <w:abstractNumId w:val="10"/>
+  </w:num>
+  <w:num w:numId="12">
+    <w:abstractNumId w:val="11"/>
+  </w:num>
+  <w:num w:numId="13">
+    <w:abstractNumId w:val="12"/>
+  </w:num>
+  <w:num w:numId="14">
+    <w:abstractNumId w:val="13"/>
   </w:num>
 </w:numbering>
 </file>

</xml_diff>